<commit_message>
Rerun the pipeline with full imputations
</commit_message>
<xml_diff>
--- a/doc/manuscript.docx
+++ b/doc/manuscript.docx
@@ -1600,7 +1600,7 @@
         <w:t xml:space="preserve"> </w:t>
       </w:r>
       <w:r>
-        <w:t xml:space="preserve">to provide 3 imputed datasets.</w:t>
+        <w:t xml:space="preserve">to provide 50 imputed datasets.</w:t>
       </w:r>
       <w:r>
         <w:t xml:space="preserve"> </w:t>
@@ -1943,9 +1943,6 @@
         <w:t xml:space="preserve"> </w:t>
       </w:r>
       <w:r>
-        <w:t xml:space="preserve"> </w:t>
-      </w:r>
-      <w:r>
         <w:t xml:space="preserve">A further 345 participants (465 days) were excluded for having fewer than 4 days of valid wear time, leaving 24,264 participants and 148,749 person-days.</w:t>
       </w:r>
       <w:r>
@@ -1970,7 +1967,7 @@
         <w:t xml:space="preserve"> </w:t>
       </w:r>
       <w:r>
-        <w:t xml:space="preserve">The majority of participants came from Europe, Oceania, and South America, with limited data from other regions.</w:t>
+        <w:t xml:space="preserve">Most participants came from Europe, Oceania, and South America, with limited data from other regions.</w:t>
       </w:r>
       <w:r>
         <w:t xml:space="preserve"> </w:t>
@@ -2033,7 +2030,7 @@
         <w:t xml:space="preserve"> </w:t>
       </w:r>
       <w:r>
-        <w:t xml:space="preserve">A table of study characteristics can be found in supplementary materials.</w:t>
+        <w:t xml:space="preserve">A table of study characteristics can be found in the supplementary materials.</w:t>
       </w:r>
     </w:p>
     <w:p>
@@ -6597,13 +6594,13 @@
         <w:t xml:space="preserve"> </w:t>
       </w:r>
     </w:p>
-    <w:bookmarkStart w:id="38" w:name="X05639e6ef7ae98db4ab1ccd43c53beb5b18ad39"/>
+    <w:bookmarkStart w:id="38" w:name="X5cddb1e1efc6f7d321d14e1178505364b564f0e"/>
     <w:p>
       <w:pPr>
         <w:pStyle w:val="berschrift2"/>
       </w:pPr>
       <w:r>
-        <w:t xml:space="preserve">The effects of physical activity volume on sleep</w:t>
+        <w:t xml:space="preserve">The association between physical activity volume and sleep</w:t>
       </w:r>
     </w:p>
     <w:p>
@@ -6611,13 +6608,13 @@
         <w:pStyle w:val="FirstParagraph"/>
       </w:pPr>
       <w:r>
-        <w:t xml:space="preserve">We estimated the effects of physical activity on sleep (RQ1) using mixed-effects models.</w:t>
-      </w:r>
-      <w:r>
-        <w:t xml:space="preserve"> </w:t>
-      </w:r>
-      <w:r>
-        <w:t xml:space="preserve">The effect of physical activity volume on sleep by age are presented in Table</w:t>
+        <w:t xml:space="preserve">We estimated the association between physical activity and sleep (RQ1) using mixed-effects models.</w:t>
+      </w:r>
+      <w:r>
+        <w:t xml:space="preserve"> </w:t>
+      </w:r>
+      <w:r>
+        <w:t xml:space="preserve">These associations by age are presented in Table</w:t>
       </w:r>
       <w:r>
         <w:t xml:space="preserve"> </w:t>
@@ -6650,7 +6647,7 @@
         <w:t xml:space="preserve"> </w:t>
       </w:r>
       <w:r>
-        <w:t xml:space="preserve">While we observed statistically significant curvilinear relationships, these did not appear to meaningfully change the effect.</w:t>
+        <w:t xml:space="preserve">Although we observed statistically significant curvilinear relationships, these did not appear to meaningfully change the associations.</w:t>
       </w:r>
       <w:r>
         <w:t xml:space="preserve"> </w:t>
@@ -7077,6 +7074,54 @@
               <w:jc w:val="left"/>
             </w:pPr>
             <w:r>
+              <w:t xml:space="preserve">0.09</w:t>
+            </w:r>
+          </w:p>
+        </w:tc>
+        <w:tc>
+          <w:tcPr/>
+          <w:p>
+            <w:pPr>
+              <w:pStyle w:val="Compact"/>
+              <w:jc w:val="left"/>
+            </w:pPr>
+            <w:r>
+              <w:t xml:space="preserve">0.91</w:t>
+            </w:r>
+          </w:p>
+        </w:tc>
+        <w:tc>
+          <w:tcPr/>
+          <w:p>
+            <w:pPr>
+              <w:pStyle w:val="Compact"/>
+              <w:jc w:val="left"/>
+            </w:pPr>
+            <w:r>
+              <w:t xml:space="preserve">.364</w:t>
+            </w:r>
+          </w:p>
+        </w:tc>
+        <w:tc>
+          <w:tcPr/>
+          <w:p>
+            <w:pPr>
+              <w:pStyle w:val="Compact"/>
+              <w:jc w:val="left"/>
+            </w:pPr>
+            <w:r>
+              <w:t xml:space="preserve">0.08 [-0.08, 0.24]</w:t>
+            </w:r>
+          </w:p>
+        </w:tc>
+        <w:tc>
+          <w:tcPr/>
+          <w:p>
+            <w:pPr>
+              <w:pStyle w:val="Compact"/>
+              <w:jc w:val="left"/>
+            </w:pPr>
+            <w:r>
               <w:t xml:space="preserve">0.08</w:t>
             </w:r>
           </w:p>
@@ -7089,54 +7134,6 @@
               <w:jc w:val="left"/>
             </w:pPr>
             <w:r>
-              <w:t xml:space="preserve">0.95</w:t>
-            </w:r>
-          </w:p>
-        </w:tc>
-        <w:tc>
-          <w:tcPr/>
-          <w:p>
-            <w:pPr>
-              <w:pStyle w:val="Compact"/>
-              <w:jc w:val="left"/>
-            </w:pPr>
-            <w:r>
-              <w:t xml:space="preserve">.342</w:t>
-            </w:r>
-          </w:p>
-        </w:tc>
-        <w:tc>
-          <w:tcPr/>
-          <w:p>
-            <w:pPr>
-              <w:pStyle w:val="Compact"/>
-              <w:jc w:val="left"/>
-            </w:pPr>
-            <w:r>
-              <w:t xml:space="preserve">0.08 [-0.08, 0.24]</w:t>
-            </w:r>
-          </w:p>
-        </w:tc>
-        <w:tc>
-          <w:tcPr/>
-          <w:p>
-            <w:pPr>
-              <w:pStyle w:val="Compact"/>
-              <w:jc w:val="left"/>
-            </w:pPr>
-            <w:r>
-              <w:t xml:space="preserve">0.08</w:t>
-            </w:r>
-          </w:p>
-        </w:tc>
-        <w:tc>
-          <w:tcPr/>
-          <w:p>
-            <w:pPr>
-              <w:pStyle w:val="Compact"/>
-              <w:jc w:val="left"/>
-            </w:pPr>
-            <w:r>
               <w:t xml:space="preserve">1.00</w:t>
             </w:r>
           </w:p>
@@ -7149,7 +7146,7 @@
               <w:jc w:val="left"/>
             </w:pPr>
             <w:r>
-              <w:t xml:space="preserve">.315</w:t>
+              <w:t xml:space="preserve">.320</w:t>
             </w:r>
           </w:p>
         </w:tc>
@@ -7199,7 +7196,7 @@
               <w:jc w:val="left"/>
             </w:pPr>
             <w:r>
-              <w:t xml:space="preserve">13.00</w:t>
+              <w:t xml:space="preserve">11.23</w:t>
             </w:r>
           </w:p>
         </w:tc>
@@ -7223,7 +7220,7 @@
               <w:jc w:val="left"/>
             </w:pPr>
             <w:r>
-              <w:t xml:space="preserve">0.09 [0.06, 0.12]</w:t>
+              <w:t xml:space="preserve">0.09 [0.06, 0.11]</w:t>
             </w:r>
           </w:p>
         </w:tc>
@@ -7247,7 +7244,7 @@
               <w:jc w:val="left"/>
             </w:pPr>
             <w:r>
-              <w:t xml:space="preserve">7.59</w:t>
+              <w:t xml:space="preserve">7.80</w:t>
             </w:r>
           </w:p>
         </w:tc>
@@ -7309,7 +7306,7 @@
               <w:jc w:val="left"/>
             </w:pPr>
             <w:r>
-              <w:t xml:space="preserve">-3.34</w:t>
+              <w:t xml:space="preserve">-3.32</w:t>
             </w:r>
           </w:p>
         </w:tc>
@@ -7357,7 +7354,7 @@
               <w:jc w:val="left"/>
             </w:pPr>
             <w:r>
-              <w:t xml:space="preserve">-3.42</w:t>
+              <w:t xml:space="preserve">-3.45</w:t>
             </w:r>
           </w:p>
         </w:tc>
@@ -7433,7 +7430,7 @@
               <w:jc w:val="left"/>
             </w:pPr>
             <w:r>
-              <w:t xml:space="preserve">-3.64</w:t>
+              <w:t xml:space="preserve">-3.43</w:t>
             </w:r>
           </w:p>
         </w:tc>
@@ -7481,19 +7478,19 @@
               <w:jc w:val="left"/>
             </w:pPr>
             <w:r>
-              <w:t xml:space="preserve">1.59</w:t>
-            </w:r>
-          </w:p>
-        </w:tc>
-        <w:tc>
-          <w:tcPr/>
-          <w:p>
-            <w:pPr>
-              <w:pStyle w:val="Compact"/>
-              <w:jc w:val="left"/>
-            </w:pPr>
-            <w:r>
-              <w:t xml:space="preserve">.130</w:t>
+              <w:t xml:space="preserve">1.86</w:t>
+            </w:r>
+          </w:p>
+        </w:tc>
+        <w:tc>
+          <w:tcPr/>
+          <w:p>
+            <w:pPr>
+              <w:pStyle w:val="Compact"/>
+              <w:jc w:val="left"/>
+            </w:pPr>
+            <w:r>
+              <w:t xml:space="preserve">.063</w:t>
             </w:r>
           </w:p>
         </w:tc>
@@ -7560,7 +7557,7 @@
               <w:jc w:val="left"/>
             </w:pPr>
             <w:r>
-              <w:t xml:space="preserve">-4.25</w:t>
+              <w:t xml:space="preserve">-4.00</w:t>
             </w:r>
           </w:p>
         </w:tc>
@@ -7608,7 +7605,7 @@
               <w:jc w:val="left"/>
             </w:pPr>
             <w:r>
-              <w:t xml:space="preserve">-5.32</w:t>
+              <w:t xml:space="preserve">-5.09</w:t>
             </w:r>
           </w:p>
         </w:tc>
@@ -7701,19 +7698,19 @@
               <w:jc w:val="left"/>
             </w:pPr>
             <w:r>
-              <w:t xml:space="preserve">-1.57</w:t>
-            </w:r>
-          </w:p>
-        </w:tc>
-        <w:tc>
-          <w:tcPr/>
-          <w:p>
-            <w:pPr>
-              <w:pStyle w:val="Compact"/>
-              <w:jc w:val="left"/>
-            </w:pPr>
-            <w:r>
-              <w:t xml:space="preserve">.135</w:t>
+              <w:t xml:space="preserve">-0.85</w:t>
+            </w:r>
+          </w:p>
+        </w:tc>
+        <w:tc>
+          <w:tcPr/>
+          <w:p>
+            <w:pPr>
+              <w:pStyle w:val="Compact"/>
+              <w:jc w:val="left"/>
+            </w:pPr>
+            <w:r>
+              <w:t xml:space="preserve">.397</w:t>
             </w:r>
           </w:p>
         </w:tc>
@@ -7749,19 +7746,19 @@
               <w:jc w:val="left"/>
             </w:pPr>
             <w:r>
-              <w:t xml:space="preserve">-3.41</w:t>
-            </w:r>
-          </w:p>
-        </w:tc>
-        <w:tc>
-          <w:tcPr/>
-          <w:p>
-            <w:pPr>
-              <w:pStyle w:val="Compact"/>
-              <w:jc w:val="left"/>
-            </w:pPr>
-            <w:r>
-              <w:t xml:space="preserve">.003</w:t>
+              <w:t xml:space="preserve">-3.73</w:t>
+            </w:r>
+          </w:p>
+        </w:tc>
+        <w:tc>
+          <w:tcPr/>
+          <w:p>
+            <w:pPr>
+              <w:pStyle w:val="Compact"/>
+              <w:jc w:val="left"/>
+            </w:pPr>
+            <w:r>
+              <w:t xml:space="preserve">&lt; .001</w:t>
             </w:r>
           </w:p>
         </w:tc>
@@ -7865,7 +7862,7 @@
               <w:jc w:val="left"/>
             </w:pPr>
             <w:r>
-              <w:t xml:space="preserve">0.16 [0.00, 0.32]</w:t>
+              <w:t xml:space="preserve">0.16 [0.00, 0.33]</w:t>
             </w:r>
           </w:p>
         </w:tc>
@@ -7889,19 +7886,19 @@
               <w:jc w:val="left"/>
             </w:pPr>
             <w:r>
-              <w:t xml:space="preserve">2.00</w:t>
-            </w:r>
-          </w:p>
-        </w:tc>
-        <w:tc>
-          <w:tcPr/>
-          <w:p>
-            <w:pPr>
-              <w:pStyle w:val="Compact"/>
-              <w:jc w:val="left"/>
-            </w:pPr>
-            <w:r>
-              <w:t xml:space="preserve">.046</w:t>
+              <w:t xml:space="preserve">1.98</w:t>
+            </w:r>
+          </w:p>
+        </w:tc>
+        <w:tc>
+          <w:tcPr/>
+          <w:p>
+            <w:pPr>
+              <w:pStyle w:val="Compact"/>
+              <w:jc w:val="left"/>
+            </w:pPr>
+            <w:r>
+              <w:t xml:space="preserve">.048</w:t>
             </w:r>
           </w:p>
         </w:tc>
@@ -7949,7 +7946,7 @@
               <w:jc w:val="left"/>
             </w:pPr>
             <w:r>
-              <w:t xml:space="preserve">.035</w:t>
+              <w:t xml:space="preserve">.034</w:t>
             </w:r>
           </w:p>
         </w:tc>
@@ -7975,7 +7972,7 @@
               <w:jc w:val="left"/>
             </w:pPr>
             <w:r>
-              <w:t xml:space="preserve">0.11 [0.09, 0.13]</w:t>
+              <w:t xml:space="preserve">0.11 [0.10, 0.13]</w:t>
             </w:r>
           </w:p>
         </w:tc>
@@ -7999,7 +7996,7 @@
               <w:jc w:val="left"/>
             </w:pPr>
             <w:r>
-              <w:t xml:space="preserve">13.39</w:t>
+              <w:t xml:space="preserve">14.52</w:t>
             </w:r>
           </w:p>
         </w:tc>
@@ -8023,7 +8020,7 @@
               <w:jc w:val="left"/>
             </w:pPr>
             <w:r>
-              <w:t xml:space="preserve">0.07 [0.05, 0.10]</w:t>
+              <w:t xml:space="preserve">0.07 [0.05, 0.09]</w:t>
             </w:r>
           </w:p>
         </w:tc>
@@ -8047,7 +8044,7 @@
               <w:jc w:val="left"/>
             </w:pPr>
             <w:r>
-              <w:t xml:space="preserve">7.52</w:t>
+              <w:t xml:space="preserve">7.98</w:t>
             </w:r>
           </w:p>
         </w:tc>
@@ -8109,19 +8106,19 @@
               <w:jc w:val="left"/>
             </w:pPr>
             <w:r>
-              <w:t xml:space="preserve">-0.61</w:t>
-            </w:r>
-          </w:p>
-        </w:tc>
-        <w:tc>
-          <w:tcPr/>
-          <w:p>
-            <w:pPr>
-              <w:pStyle w:val="Compact"/>
-              <w:jc w:val="left"/>
-            </w:pPr>
-            <w:r>
-              <w:t xml:space="preserve">.545</w:t>
+              <w:t xml:space="preserve">-0.56</w:t>
+            </w:r>
+          </w:p>
+        </w:tc>
+        <w:tc>
+          <w:tcPr/>
+          <w:p>
+            <w:pPr>
+              <w:pStyle w:val="Compact"/>
+              <w:jc w:val="left"/>
+            </w:pPr>
+            <w:r>
+              <w:t xml:space="preserve">.573</w:t>
             </w:r>
           </w:p>
         </w:tc>
@@ -8157,19 +8154,19 @@
               <w:jc w:val="left"/>
             </w:pPr>
             <w:r>
-              <w:t xml:space="preserve">-1.53</w:t>
-            </w:r>
-          </w:p>
-        </w:tc>
-        <w:tc>
-          <w:tcPr/>
-          <w:p>
-            <w:pPr>
-              <w:pStyle w:val="Compact"/>
-              <w:jc w:val="left"/>
-            </w:pPr>
-            <w:r>
-              <w:t xml:space="preserve">.127</w:t>
+              <w:t xml:space="preserve">-1.49</w:t>
+            </w:r>
+          </w:p>
+        </w:tc>
+        <w:tc>
+          <w:tcPr/>
+          <w:p>
+            <w:pPr>
+              <w:pStyle w:val="Compact"/>
+              <w:jc w:val="left"/>
+            </w:pPr>
+            <w:r>
+              <w:t xml:space="preserve">.136</w:t>
             </w:r>
           </w:p>
         </w:tc>
@@ -8233,7 +8230,7 @@
               <w:jc w:val="left"/>
             </w:pPr>
             <w:r>
-              <w:t xml:space="preserve">-12.56</w:t>
+              <w:t xml:space="preserve">-12.10</w:t>
             </w:r>
           </w:p>
         </w:tc>
@@ -8269,19 +8266,19 @@
               <w:jc w:val="left"/>
             </w:pPr>
             <w:r>
-              <w:t xml:space="preserve">0.01</w:t>
-            </w:r>
-          </w:p>
-        </w:tc>
-        <w:tc>
-          <w:tcPr/>
-          <w:p>
-            <w:pPr>
-              <w:pStyle w:val="Compact"/>
-              <w:jc w:val="left"/>
-            </w:pPr>
-            <w:r>
-              <w:t xml:space="preserve">-7.47</w:t>
+              <w:t xml:space="preserve">0.00</w:t>
+            </w:r>
+          </w:p>
+        </w:tc>
+        <w:tc>
+          <w:tcPr/>
+          <w:p>
+            <w:pPr>
+              <w:pStyle w:val="Compact"/>
+              <w:jc w:val="left"/>
+            </w:pPr>
+            <w:r>
+              <w:t xml:space="preserve">-7.59</w:t>
             </w:r>
           </w:p>
         </w:tc>
@@ -8360,7 +8357,7 @@
               <w:jc w:val="left"/>
             </w:pPr>
             <w:r>
-              <w:t xml:space="preserve">-11.89</w:t>
+              <w:t xml:space="preserve">-12.11</w:t>
             </w:r>
           </w:p>
         </w:tc>
@@ -8408,7 +8405,7 @@
               <w:jc w:val="left"/>
             </w:pPr>
             <w:r>
-              <w:t xml:space="preserve">-6.78</w:t>
+              <w:t xml:space="preserve">-7.12</w:t>
             </w:r>
           </w:p>
         </w:tc>
@@ -8501,19 +8498,19 @@
               <w:jc w:val="left"/>
             </w:pPr>
             <w:r>
-              <w:t xml:space="preserve">2.59</w:t>
-            </w:r>
-          </w:p>
-        </w:tc>
-        <w:tc>
-          <w:tcPr/>
-          <w:p>
-            <w:pPr>
-              <w:pStyle w:val="Compact"/>
-              <w:jc w:val="left"/>
-            </w:pPr>
-            <w:r>
-              <w:t xml:space="preserve">.010</w:t>
+              <w:t xml:space="preserve">2.41</w:t>
+            </w:r>
+          </w:p>
+        </w:tc>
+        <w:tc>
+          <w:tcPr/>
+          <w:p>
+            <w:pPr>
+              <w:pStyle w:val="Compact"/>
+              <w:jc w:val="left"/>
+            </w:pPr>
+            <w:r>
+              <w:t xml:space="preserve">.016</w:t>
             </w:r>
           </w:p>
         </w:tc>
@@ -8549,7 +8546,7 @@
               <w:jc w:val="left"/>
             </w:pPr>
             <w:r>
-              <w:t xml:space="preserve">6.40</w:t>
+              <w:t xml:space="preserve">6.18</w:t>
             </w:r>
           </w:p>
         </w:tc>
@@ -8689,19 +8686,19 @@
               <w:jc w:val="left"/>
             </w:pPr>
             <w:r>
-              <w:t xml:space="preserve">0.71</w:t>
-            </w:r>
-          </w:p>
-        </w:tc>
-        <w:tc>
-          <w:tcPr/>
-          <w:p>
-            <w:pPr>
-              <w:pStyle w:val="Compact"/>
-              <w:jc w:val="left"/>
-            </w:pPr>
-            <w:r>
-              <w:t xml:space="preserve">.479</w:t>
+              <w:t xml:space="preserve">0.70</w:t>
+            </w:r>
+          </w:p>
+        </w:tc>
+        <w:tc>
+          <w:tcPr/>
+          <w:p>
+            <w:pPr>
+              <w:pStyle w:val="Compact"/>
+              <w:jc w:val="left"/>
+            </w:pPr>
+            <w:r>
+              <w:t xml:space="preserve">.485</w:t>
             </w:r>
           </w:p>
         </w:tc>
@@ -8775,7 +8772,7 @@
               <w:jc w:val="left"/>
             </w:pPr>
             <w:r>
-              <w:t xml:space="preserve">-0.02 [-0.03, -0.01]</w:t>
+              <w:t xml:space="preserve">-0.02 [-0.04, -0.01]</w:t>
             </w:r>
           </w:p>
         </w:tc>
@@ -8799,7 +8796,7 @@
               <w:jc w:val="left"/>
             </w:pPr>
             <w:r>
-              <w:t xml:space="preserve">-4.22</w:t>
+              <w:t xml:space="preserve">-3.95</w:t>
             </w:r>
           </w:p>
         </w:tc>
@@ -8823,7 +8820,7 @@
               <w:jc w:val="left"/>
             </w:pPr>
             <w:r>
-              <w:t xml:space="preserve">-0.06 [-0.08, -0.05]</w:t>
+              <w:t xml:space="preserve">-0.06 [-0.07, -0.05]</w:t>
             </w:r>
           </w:p>
         </w:tc>
@@ -8847,7 +8844,7 @@
               <w:jc w:val="left"/>
             </w:pPr>
             <w:r>
-              <w:t xml:space="preserve">-8.98</w:t>
+              <w:t xml:space="preserve">-9.61</w:t>
             </w:r>
           </w:p>
         </w:tc>
@@ -8909,19 +8906,19 @@
               <w:jc w:val="left"/>
             </w:pPr>
             <w:r>
-              <w:t xml:space="preserve">-1.61</w:t>
-            </w:r>
-          </w:p>
-        </w:tc>
-        <w:tc>
-          <w:tcPr/>
-          <w:p>
-            <w:pPr>
-              <w:pStyle w:val="Compact"/>
-              <w:jc w:val="left"/>
-            </w:pPr>
-            <w:r>
-              <w:t xml:space="preserve">.111</w:t>
+              <w:t xml:space="preserve">-1.65</w:t>
+            </w:r>
+          </w:p>
+        </w:tc>
+        <w:tc>
+          <w:tcPr/>
+          <w:p>
+            <w:pPr>
+              <w:pStyle w:val="Compact"/>
+              <w:jc w:val="left"/>
+            </w:pPr>
+            <w:r>
+              <w:t xml:space="preserve">.099</w:t>
             </w:r>
           </w:p>
         </w:tc>
@@ -8957,19 +8954,19 @@
               <w:jc w:val="left"/>
             </w:pPr>
             <w:r>
-              <w:t xml:space="preserve">-0.69</w:t>
-            </w:r>
-          </w:p>
-        </w:tc>
-        <w:tc>
-          <w:tcPr/>
-          <w:p>
-            <w:pPr>
-              <w:pStyle w:val="Compact"/>
-              <w:jc w:val="left"/>
-            </w:pPr>
-            <w:r>
-              <w:t xml:space="preserve">.493</w:t>
+              <w:t xml:space="preserve">-0.74</w:t>
+            </w:r>
+          </w:p>
+        </w:tc>
+        <w:tc>
+          <w:tcPr/>
+          <w:p>
+            <w:pPr>
+              <w:pStyle w:val="Compact"/>
+              <w:jc w:val="left"/>
+            </w:pPr>
+            <w:r>
+              <w:t xml:space="preserve">.457</w:t>
             </w:r>
           </w:p>
         </w:tc>
@@ -9033,7 +9030,7 @@
               <w:jc w:val="left"/>
             </w:pPr>
             <w:r>
-              <w:t xml:space="preserve">-7.33</w:t>
+              <w:t xml:space="preserve">-6.43</w:t>
             </w:r>
           </w:p>
         </w:tc>
@@ -9081,7 +9078,7 @@
               <w:jc w:val="left"/>
             </w:pPr>
             <w:r>
-              <w:t xml:space="preserve">-7.50</w:t>
+              <w:t xml:space="preserve">-8.22</w:t>
             </w:r>
           </w:p>
         </w:tc>
@@ -9160,7 +9157,7 @@
               <w:jc w:val="left"/>
             </w:pPr>
             <w:r>
-              <w:t xml:space="preserve">-15.31</w:t>
+              <w:t xml:space="preserve">-14.02</w:t>
             </w:r>
           </w:p>
         </w:tc>
@@ -9208,19 +9205,19 @@
               <w:jc w:val="left"/>
             </w:pPr>
             <w:r>
-              <w:t xml:space="preserve">1.85</w:t>
-            </w:r>
-          </w:p>
-        </w:tc>
-        <w:tc>
-          <w:tcPr/>
-          <w:p>
-            <w:pPr>
-              <w:pStyle w:val="Compact"/>
-              <w:jc w:val="left"/>
-            </w:pPr>
-            <w:r>
-              <w:t xml:space="preserve">.068</w:t>
+              <w:t xml:space="preserve">1.84</w:t>
+            </w:r>
+          </w:p>
+        </w:tc>
+        <w:tc>
+          <w:tcPr/>
+          <w:p>
+            <w:pPr>
+              <w:pStyle w:val="Compact"/>
+              <w:jc w:val="left"/>
+            </w:pPr>
+            <w:r>
+              <w:t xml:space="preserve">.066</w:t>
             </w:r>
           </w:p>
         </w:tc>
@@ -9301,7 +9298,7 @@
               <w:jc w:val="left"/>
             </w:pPr>
             <w:r>
-              <w:t xml:space="preserve">9.23</w:t>
+              <w:t xml:space="preserve">8.11</w:t>
             </w:r>
           </w:p>
         </w:tc>
@@ -9349,7 +9346,7 @@
               <w:jc w:val="left"/>
             </w:pPr>
             <w:r>
-              <w:t xml:space="preserve">10.73</w:t>
+              <w:t xml:space="preserve">10.79</w:t>
             </w:r>
           </w:p>
         </w:tc>
@@ -9465,55 +9462,55 @@
               <w:jc w:val="left"/>
             </w:pPr>
             <w:r>
-              <w:t xml:space="preserve">0.15 [-0.01, 0.32]</w:t>
-            </w:r>
-          </w:p>
-        </w:tc>
-        <w:tc>
-          <w:tcPr/>
-          <w:p>
-            <w:pPr>
-              <w:pStyle w:val="Compact"/>
-              <w:jc w:val="left"/>
-            </w:pPr>
-            <w:r>
-              <w:t xml:space="preserve">0.08</w:t>
-            </w:r>
-          </w:p>
-        </w:tc>
-        <w:tc>
-          <w:tcPr/>
-          <w:p>
-            <w:pPr>
-              <w:pStyle w:val="Compact"/>
-              <w:jc w:val="left"/>
-            </w:pPr>
-            <w:r>
-              <w:t xml:space="preserve">1.95</w:t>
-            </w:r>
-          </w:p>
-        </w:tc>
-        <w:tc>
-          <w:tcPr/>
-          <w:p>
-            <w:pPr>
-              <w:pStyle w:val="Compact"/>
-              <w:jc w:val="left"/>
-            </w:pPr>
-            <w:r>
-              <w:t xml:space="preserve">.067</w:t>
-            </w:r>
-          </w:p>
-        </w:tc>
-        <w:tc>
-          <w:tcPr/>
-          <w:p>
-            <w:pPr>
-              <w:pStyle w:val="Compact"/>
-              <w:jc w:val="left"/>
-            </w:pPr>
-            <w:r>
-              <w:t xml:space="preserve">0.31 [0.13, 0.49]</w:t>
+              <w:t xml:space="preserve">0.12 [-0.02, 0.27]</w:t>
+            </w:r>
+          </w:p>
+        </w:tc>
+        <w:tc>
+          <w:tcPr/>
+          <w:p>
+            <w:pPr>
+              <w:pStyle w:val="Compact"/>
+              <w:jc w:val="left"/>
+            </w:pPr>
+            <w:r>
+              <w:t xml:space="preserve">0.07</w:t>
+            </w:r>
+          </w:p>
+        </w:tc>
+        <w:tc>
+          <w:tcPr/>
+          <w:p>
+            <w:pPr>
+              <w:pStyle w:val="Compact"/>
+              <w:jc w:val="left"/>
+            </w:pPr>
+            <w:r>
+              <w:t xml:space="preserve">1.67</w:t>
+            </w:r>
+          </w:p>
+        </w:tc>
+        <w:tc>
+          <w:tcPr/>
+          <w:p>
+            <w:pPr>
+              <w:pStyle w:val="Compact"/>
+              <w:jc w:val="left"/>
+            </w:pPr>
+            <w:r>
+              <w:t xml:space="preserve">.096</w:t>
+            </w:r>
+          </w:p>
+        </w:tc>
+        <w:tc>
+          <w:tcPr/>
+          <w:p>
+            <w:pPr>
+              <w:pStyle w:val="Compact"/>
+              <w:jc w:val="left"/>
+            </w:pPr>
+            <w:r>
+              <w:t xml:space="preserve">0.28 [0.11, 0.45]</w:t>
             </w:r>
           </w:p>
         </w:tc>
@@ -9537,19 +9534,19 @@
               <w:jc w:val="left"/>
             </w:pPr>
             <w:r>
-              <w:t xml:space="preserve">3.40</w:t>
-            </w:r>
-          </w:p>
-        </w:tc>
-        <w:tc>
-          <w:tcPr/>
-          <w:p>
-            <w:pPr>
-              <w:pStyle w:val="Compact"/>
-              <w:jc w:val="left"/>
-            </w:pPr>
-            <w:r>
-              <w:t xml:space="preserve">.001</w:t>
+              <w:t xml:space="preserve">3.16</w:t>
+            </w:r>
+          </w:p>
+        </w:tc>
+        <w:tc>
+          <w:tcPr/>
+          <w:p>
+            <w:pPr>
+              <w:pStyle w:val="Compact"/>
+              <w:jc w:val="left"/>
+            </w:pPr>
+            <w:r>
+              <w:t xml:space="preserve">.002</w:t>
             </w:r>
           </w:p>
         </w:tc>
@@ -9575,7 +9572,7 @@
               <w:jc w:val="left"/>
             </w:pPr>
             <w:r>
-              <w:t xml:space="preserve">0.25 [0.21, 0.29]</w:t>
+              <w:t xml:space="preserve">0.25 [0.23, 0.26]</w:t>
             </w:r>
           </w:p>
         </w:tc>
@@ -9599,7 +9596,7 @@
               <w:jc w:val="left"/>
             </w:pPr>
             <w:r>
-              <w:t xml:space="preserve">17.91</w:t>
+              <w:t xml:space="preserve">28.89</w:t>
             </w:r>
           </w:p>
         </w:tc>
@@ -9623,7 +9620,7 @@
               <w:jc w:val="left"/>
             </w:pPr>
             <w:r>
-              <w:t xml:space="preserve">0.29 [0.26, 0.32]</w:t>
+              <w:t xml:space="preserve">0.29 [0.27, 0.31]</w:t>
             </w:r>
           </w:p>
         </w:tc>
@@ -9647,7 +9644,7 @@
               <w:jc w:val="left"/>
             </w:pPr>
             <w:r>
-              <w:t xml:space="preserve">22.24</w:t>
+              <w:t xml:space="preserve">28.95</w:t>
             </w:r>
           </w:p>
         </w:tc>
@@ -9685,7 +9682,7 @@
               <w:jc w:val="left"/>
             </w:pPr>
             <w:r>
-              <w:t xml:space="preserve">0.00 [-0.01, 0.01]</w:t>
+              <w:t xml:space="preserve">0.00 [0.00, 0.00]</w:t>
             </w:r>
           </w:p>
         </w:tc>
@@ -9709,19 +9706,19 @@
               <w:jc w:val="left"/>
             </w:pPr>
             <w:r>
-              <w:t xml:space="preserve">-0.14</w:t>
-            </w:r>
-          </w:p>
-        </w:tc>
-        <w:tc>
-          <w:tcPr/>
-          <w:p>
-            <w:pPr>
-              <w:pStyle w:val="Compact"/>
-              <w:jc w:val="left"/>
-            </w:pPr>
-            <w:r>
-              <w:t xml:space="preserve">.900</w:t>
+              <w:t xml:space="preserve">0.45</w:t>
+            </w:r>
+          </w:p>
+        </w:tc>
+        <w:tc>
+          <w:tcPr/>
+          <w:p>
+            <w:pPr>
+              <w:pStyle w:val="Compact"/>
+              <w:jc w:val="left"/>
+            </w:pPr>
+            <w:r>
+              <w:t xml:space="preserve">.656</w:t>
             </w:r>
           </w:p>
         </w:tc>
@@ -9757,19 +9754,19 @@
               <w:jc w:val="left"/>
             </w:pPr>
             <w:r>
-              <w:t xml:space="preserve">-3.62</w:t>
-            </w:r>
-          </w:p>
-        </w:tc>
-        <w:tc>
-          <w:tcPr/>
-          <w:p>
-            <w:pPr>
-              <w:pStyle w:val="Compact"/>
-              <w:jc w:val="left"/>
-            </w:pPr>
-            <w:r>
-              <w:t xml:space="preserve">.036</w:t>
+              <w:t xml:space="preserve">-3.57</w:t>
+            </w:r>
+          </w:p>
+        </w:tc>
+        <w:tc>
+          <w:tcPr/>
+          <w:p>
+            <w:pPr>
+              <w:pStyle w:val="Compact"/>
+              <w:jc w:val="left"/>
+            </w:pPr>
+            <w:r>
+              <w:t xml:space="preserve">&lt; .001</w:t>
             </w:r>
           </w:p>
         </w:tc>
@@ -9809,7 +9806,7 @@
               <w:jc w:val="left"/>
             </w:pPr>
             <w:r>
-              <w:t xml:space="preserve">-0.02 [-0.03, -0.01]</w:t>
+              <w:t xml:space="preserve">-0.02 [-0.03, -0.02]</w:t>
             </w:r>
           </w:p>
         </w:tc>
@@ -9833,19 +9830,19 @@
               <w:jc w:val="left"/>
             </w:pPr>
             <w:r>
-              <w:t xml:space="preserve">-6.60</w:t>
-            </w:r>
-          </w:p>
-        </w:tc>
-        <w:tc>
-          <w:tcPr/>
-          <w:p>
-            <w:pPr>
-              <w:pStyle w:val="Compact"/>
-              <w:jc w:val="left"/>
-            </w:pPr>
-            <w:r>
-              <w:t xml:space="preserve">.002</w:t>
+              <w:t xml:space="preserve">-8.56</w:t>
+            </w:r>
+          </w:p>
+        </w:tc>
+        <w:tc>
+          <w:tcPr/>
+          <w:p>
+            <w:pPr>
+              <w:pStyle w:val="Compact"/>
+              <w:jc w:val="left"/>
+            </w:pPr>
+            <w:r>
+              <w:t xml:space="preserve">&lt; .001</w:t>
             </w:r>
           </w:p>
         </w:tc>
@@ -9881,7 +9878,7 @@
               <w:jc w:val="left"/>
             </w:pPr>
             <w:r>
-              <w:t xml:space="preserve">-19.48</w:t>
+              <w:t xml:space="preserve">-17.67</w:t>
             </w:r>
           </w:p>
         </w:tc>
@@ -9960,19 +9957,19 @@
               <w:jc w:val="left"/>
             </w:pPr>
             <w:r>
-              <w:t xml:space="preserve">-1.49</w:t>
-            </w:r>
-          </w:p>
-        </w:tc>
-        <w:tc>
-          <w:tcPr/>
-          <w:p>
-            <w:pPr>
-              <w:pStyle w:val="Compact"/>
-              <w:jc w:val="left"/>
-            </w:pPr>
-            <w:r>
-              <w:t xml:space="preserve">.211</w:t>
+              <w:t xml:space="preserve">-1.33</w:t>
+            </w:r>
+          </w:p>
+        </w:tc>
+        <w:tc>
+          <w:tcPr/>
+          <w:p>
+            <w:pPr>
+              <w:pStyle w:val="Compact"/>
+              <w:jc w:val="left"/>
+            </w:pPr>
+            <w:r>
+              <w:t xml:space="preserve">.186</w:t>
             </w:r>
           </w:p>
         </w:tc>
@@ -10008,7 +10005,7 @@
               <w:jc w:val="left"/>
             </w:pPr>
             <w:r>
-              <w:t xml:space="preserve">-19.73</w:t>
+              <w:t xml:space="preserve">-20.95</w:t>
             </w:r>
           </w:p>
         </w:tc>
@@ -10101,7 +10098,7 @@
               <w:jc w:val="left"/>
             </w:pPr>
             <w:r>
-              <w:t xml:space="preserve">-15.25</w:t>
+              <w:t xml:space="preserve">-8.31</w:t>
             </w:r>
           </w:p>
         </w:tc>
@@ -10149,7 +10146,7 @@
               <w:jc w:val="left"/>
             </w:pPr>
             <w:r>
-              <w:t xml:space="preserve">9.81</w:t>
+              <w:t xml:space="preserve">8.92</w:t>
             </w:r>
           </w:p>
         </w:tc>
@@ -10182,7 +10179,16 @@
         <w:t xml:space="preserve"> </w:t>
       </w:r>
       <w:r>
-        <w:t xml:space="preserve">Adjusted for SES, sex, and BMI z-score. Outcomes variables are listed in the column headers.</w:t>
+        <w:t xml:space="preserve">Adjusted for SES, sex, and BMI z-score. Outcomes variables are listed in the column headers. Standardized (z-scores) are indicated with</w:t>
+      </w:r>
+      <w:r>
+        <w:t xml:space="preserve"> </w:t>
+      </w:r>
+      <w:r>
+        <w:t xml:space="preserve">‘(z)’</w:t>
+      </w:r>
+      <w:r>
+        <w:t xml:space="preserve">.</w:t>
       </w:r>
     </w:p>
     <w:p>
@@ -10202,12 +10208,12 @@
           <wp:inline>
             <wp:extent cx="6565900" cy="4377678"/>
             <wp:effectExtent b="0" l="0" r="0" t="0"/>
-            <wp:docPr descr="Figure 1: Sleep metrics predicted by physical activity volume. The panels on the left show the curvilinear relationship between PA volume and each of the sleep outcomes at the ages indicated in each column. The panels on the right show the same relationships but by age continuously. The white band indicates predictions which were not significantly different from zero. These plots demonstrate exact turning points where the effects of PA volume change by age." title="" id="35" name="Picture"/>
+            <wp:docPr descr="Figure 1: Standardized sleep metrics predicted by physical activity volume. The panels on the left show the curvilinear relationship between PA volume and each of the sleep outcomes at the ages indicated in each column. The panels on the right show the same relationships but by age continuously. The white band indicates predictions which were not significantly different from zero. These plots demonstrate exact turning points where the effects of PA volume change by age." title="" id="35" name="Picture"/>
             <a:graphic>
               <a:graphicData uri="http://schemas.openxmlformats.org/drawingml/2006/picture">
                 <pic:pic>
                   <pic:nvPicPr>
-                    <pic:cNvPr descr="manuscript_files/a2c78dfa0c4a3fd655c12840dc930606b6725e17.jpg" id="36" name="Picture"/>
+                    <pic:cNvPr descr="manuscript_files/0f0db1f63932761f4b473b5d40ea35f806600bb4.jpg" id="36" name="Picture"/>
                     <pic:cNvPicPr>
                       <a:picLocks noChangeArrowheads="1" noChangeAspect="1"/>
                     </pic:cNvPicPr>
@@ -10257,17 +10263,17 @@
         <w:t xml:space="preserve"> </w:t>
       </w:r>
       <w:r>
-        <w:t xml:space="preserve">1. Sleep metrics predicted by physical activity volume. The panels on the left show the curvilinear relationship between PA volume and each of the sleep outcomes at the ages indicated in each column. The panels on the right show the same relationships but by age continuously. The white band indicates predictions which were not significantly different from zero. These plots demonstrate exact turning points where the effects of PA volume change by age.</w:t>
+        <w:t xml:space="preserve">1. Standardized sleep metrics predicted by physical activity volume. The panels on the left show the curvilinear relationship between PA volume and each of the sleep outcomes at the ages indicated in each column. The panels on the right show the same relationships but by age continuously. The white band indicates predictions which were not significantly different from zero. These plots demonstrate exact turning points where the effects of PA volume change by age.</w:t>
       </w:r>
     </w:p>
     <w:bookmarkEnd w:id="38"/>
-    <w:bookmarkStart w:id="43" w:name="Xa76f34ddb50b78b74a569c66731f68ed699c5c1"/>
+    <w:bookmarkStart w:id="43" w:name="Xc23038fc4c9f936a2c498333e40ccfa18826f84"/>
     <w:p>
       <w:pPr>
         <w:pStyle w:val="berschrift2"/>
       </w:pPr>
       <w:r>
-        <w:t xml:space="preserve">The effects of physical activity intensity on sleep</w:t>
+        <w:t xml:space="preserve">The association between physical activity intensity and sleep</w:t>
       </w:r>
     </w:p>
     <w:p>
@@ -10275,7 +10281,7 @@
         <w:pStyle w:val="FirstParagraph"/>
       </w:pPr>
       <w:r>
-        <w:t xml:space="preserve">We estimated how physical activity intensity affects sleep across different age groups and present the results controlling for sex, SES, and BMI, in Table</w:t>
+        <w:t xml:space="preserve">We estimated how physical activity intensity is associated with sleep across different age groups and present the results controlling for sex, SES, and BMI, in Table</w:t>
       </w:r>
       <w:r>
         <w:t xml:space="preserve"> </w:t>
@@ -10308,13 +10314,13 @@
         <w:t xml:space="preserve"> </w:t>
       </w:r>
       <w:r>
-        <w:t xml:space="preserve">As with physical activity volume, we observed statistically significant curvilinear relationships, but these were only meaningful for the impact of physical activity intensity on sleep regularity, in which very low levels of intensity were strongly associated with poor sleep regularity and the benefits of increasing intensity diminished past one standard deviation above the mean.</w:t>
-      </w:r>
-      <w:r>
-        <w:t xml:space="preserve"> </w:t>
-      </w:r>
-      <w:r>
-        <w:t xml:space="preserve">While age statistically significantly modified the relationship between physical activity intensity and sleep duration, efficiency, and regularity, the effect was negligible.</w:t>
+        <w:t xml:space="preserve">As with physical activity volume, we observed statistically significant curvilinear relationships, but these were only meaningful for the association between physical activity intensity and sleep regularity, in which very low levels of intensity were strongly associated with poor sleep regularity and the benefits of increasing intensity diminished past one standard deviation above the mean.</w:t>
+      </w:r>
+      <w:r>
+        <w:t xml:space="preserve"> </w:t>
+      </w:r>
+      <w:r>
+        <w:t xml:space="preserve">While age modified the relationship between physical activity intensity and sleep duration, efficiency, and regularity, the effect was negligible.</w:t>
       </w:r>
     </w:p>
     <w:p>
@@ -10326,12 +10332,12 @@
           <wp:inline>
             <wp:extent cx="6565900" cy="4377678"/>
             <wp:effectExtent b="0" l="0" r="0" t="0"/>
-            <wp:docPr descr="Figure 2: Sleep metrics predicted by physical activity intensity. The panels on the left show the curvilinear relationship between PA intensity and each of the sleep outcomes at the ages indicated in each column. The panels on the right show the same relationships but by age continuously. The white band indicates predictions which were not significantly different from zero." title="" id="40" name="Picture"/>
+            <wp:docPr descr="Figure 2: Sleep metrics predicted by physical activity intensity. The panels on the left show the curvilinear relationship between PA intensity and sleep outcomes at the ages indicated in each column. The panels on the right show the same relationships but by age continuously. The white band indicates predictions which were not significantly different from zero." title="" id="40" name="Picture"/>
             <a:graphic>
               <a:graphicData uri="http://schemas.openxmlformats.org/drawingml/2006/picture">
                 <pic:pic>
                   <pic:nvPicPr>
-                    <pic:cNvPr descr="manuscript_files/fbd95bca92e6f69baa21df620cfec26187c88803.jpg" id="41" name="Picture"/>
+                    <pic:cNvPr descr="manuscript_files/6fe9cc3ecdc139e58b25df64b8b5548b6abb6006.jpg" id="41" name="Picture"/>
                     <pic:cNvPicPr>
                       <a:picLocks noChangeArrowheads="1" noChangeAspect="1"/>
                     </pic:cNvPicPr>
@@ -10381,17 +10387,17 @@
         <w:t xml:space="preserve"> </w:t>
       </w:r>
       <w:r>
-        <w:t xml:space="preserve">2. Sleep metrics predicted by physical activity intensity. The panels on the left show the curvilinear relationship between PA intensity and each of the sleep outcomes at the ages indicated in each column. The panels on the right show the same relationships but by age continuously. The white band indicates predictions which were not significantly different from zero.</w:t>
+        <w:t xml:space="preserve">2. Sleep metrics predicted by physical activity intensity. The panels on the left show the curvilinear relationship between PA intensity and sleep outcomes at the ages indicated in each column. The panels on the right show the same relationships but by age continuously. The white band indicates predictions which were not significantly different from zero.</w:t>
       </w:r>
     </w:p>
     <w:bookmarkEnd w:id="43"/>
-    <w:bookmarkStart w:id="49" w:name="X1f1e5025560e06f33688db1a4382872e901155b"/>
+    <w:bookmarkStart w:id="49" w:name="X3c254931f59b38db01c871bb3824500104508b8"/>
     <w:p>
       <w:pPr>
         <w:pStyle w:val="berschrift2"/>
       </w:pPr>
       <w:r>
-        <w:t xml:space="preserve">The effects of sleep duration on physical activity</w:t>
+        <w:t xml:space="preserve">The association between of sleep duration and physical activity</w:t>
       </w:r>
     </w:p>
     <w:p>
@@ -10399,7 +10405,7 @@
         <w:pStyle w:val="FirstParagraph"/>
       </w:pPr>
       <w:r>
-        <w:t xml:space="preserve">We estimated the effect of sleep duration on physical activity by age.</w:t>
+        <w:t xml:space="preserve">We estimated the association between sleep duration and physical activity by age.</w:t>
       </w:r>
       <w:r>
         <w:t xml:space="preserve"> </w:t>
@@ -10432,7 +10438,7 @@
         <w:t xml:space="preserve"> </w:t>
       </w:r>
       <w:r>
-        <w:t xml:space="preserve">As age increases, both physical activity volume and intensity decrease.</w:t>
+        <w:t xml:space="preserve">At higher ages, both physical activity volume and intensity are lower than for lower ages.</w:t>
       </w:r>
       <w:r>
         <w:t xml:space="preserve"> </w:t>
@@ -10847,7 +10853,7 @@
               <w:jc w:val="left"/>
             </w:pPr>
             <w:r>
-              <w:t xml:space="preserve">1.18 [0.83, 1.52]</w:t>
+              <w:t xml:space="preserve">1.17 [0.82, 1.52]</w:t>
             </w:r>
           </w:p>
         </w:tc>
@@ -10871,7 +10877,7 @@
               <w:jc w:val="left"/>
             </w:pPr>
             <w:r>
-              <w:t xml:space="preserve">6.63</w:t>
+              <w:t xml:space="preserve">6.62</w:t>
             </w:r>
           </w:p>
         </w:tc>
@@ -10981,7 +10987,7 @@
               <w:jc w:val="left"/>
             </w:pPr>
             <w:r>
-              <w:t xml:space="preserve">10.43</w:t>
+              <w:t xml:space="preserve">11.10</w:t>
             </w:r>
           </w:p>
         </w:tc>
@@ -11005,7 +11011,7 @@
               <w:jc w:val="left"/>
             </w:pPr>
             <w:r>
-              <w:t xml:space="preserve">0.04 [0.03, 0.05]</w:t>
+              <w:t xml:space="preserve">0.04 [0.03, 0.04]</w:t>
             </w:r>
           </w:p>
         </w:tc>
@@ -11029,7 +11035,7 @@
               <w:jc w:val="left"/>
             </w:pPr>
             <w:r>
-              <w:t xml:space="preserve">8.38</w:t>
+              <w:t xml:space="preserve">8.13</w:t>
             </w:r>
           </w:p>
         </w:tc>
@@ -11091,7 +11097,7 @@
               <w:jc w:val="left"/>
             </w:pPr>
             <w:r>
-              <w:t xml:space="preserve">-38.85</w:t>
+              <w:t xml:space="preserve">-38.57</w:t>
             </w:r>
           </w:p>
         </w:tc>
@@ -11139,7 +11145,7 @@
               <w:jc w:val="left"/>
             </w:pPr>
             <w:r>
-              <w:t xml:space="preserve">-48.18</w:t>
+              <w:t xml:space="preserve">-47.70</w:t>
             </w:r>
           </w:p>
         </w:tc>
@@ -11191,7 +11197,7 @@
               <w:jc w:val="left"/>
             </w:pPr>
             <w:r>
-              <w:t xml:space="preserve">-0.03 [-0.03, -0.02]</w:t>
+              <w:t xml:space="preserve">-0.03 [-0.04, -0.02]</w:t>
             </w:r>
           </w:p>
         </w:tc>
@@ -11215,7 +11221,7 @@
               <w:jc w:val="left"/>
             </w:pPr>
             <w:r>
-              <w:t xml:space="preserve">-9.32</w:t>
+              <w:t xml:space="preserve">-9.73</w:t>
             </w:r>
           </w:p>
         </w:tc>
@@ -11263,7 +11269,7 @@
               <w:jc w:val="left"/>
             </w:pPr>
             <w:r>
-              <w:t xml:space="preserve">-5.72</w:t>
+              <w:t xml:space="preserve">-6.35</w:t>
             </w:r>
           </w:p>
         </w:tc>
@@ -11342,7 +11348,7 @@
               <w:jc w:val="left"/>
             </w:pPr>
             <w:r>
-              <w:t xml:space="preserve">-12.00</w:t>
+              <w:t xml:space="preserve">-12.36</w:t>
             </w:r>
           </w:p>
         </w:tc>
@@ -11390,19 +11396,19 @@
               <w:jc w:val="left"/>
             </w:pPr>
             <w:r>
-              <w:t xml:space="preserve">-3.04</w:t>
-            </w:r>
-          </w:p>
-        </w:tc>
-        <w:tc>
-          <w:tcPr/>
-          <w:p>
-            <w:pPr>
-              <w:pStyle w:val="Compact"/>
-              <w:jc w:val="left"/>
-            </w:pPr>
-            <w:r>
-              <w:t xml:space="preserve">.002</w:t>
+              <w:t xml:space="preserve">-2.87</w:t>
+            </w:r>
+          </w:p>
+        </w:tc>
+        <w:tc>
+          <w:tcPr/>
+          <w:p>
+            <w:pPr>
+              <w:pStyle w:val="Compact"/>
+              <w:jc w:val="left"/>
+            </w:pPr>
+            <w:r>
+              <w:t xml:space="preserve">.004</w:t>
             </w:r>
           </w:p>
         </w:tc>
@@ -11483,19 +11489,19 @@
               <w:jc w:val="left"/>
             </w:pPr>
             <w:r>
-              <w:t xml:space="preserve">2.60</w:t>
-            </w:r>
-          </w:p>
-        </w:tc>
-        <w:tc>
-          <w:tcPr/>
-          <w:p>
-            <w:pPr>
-              <w:pStyle w:val="Compact"/>
-              <w:jc w:val="left"/>
-            </w:pPr>
-            <w:r>
-              <w:t xml:space="preserve">.010</w:t>
+              <w:t xml:space="preserve">2.75</w:t>
+            </w:r>
+          </w:p>
+        </w:tc>
+        <w:tc>
+          <w:tcPr/>
+          <w:p>
+            <w:pPr>
+              <w:pStyle w:val="Compact"/>
+              <w:jc w:val="left"/>
+            </w:pPr>
+            <w:r>
+              <w:t xml:space="preserve">.006</w:t>
             </w:r>
           </w:p>
         </w:tc>
@@ -11531,19 +11537,19 @@
               <w:jc w:val="left"/>
             </w:pPr>
             <w:r>
-              <w:t xml:space="preserve">2.33</w:t>
-            </w:r>
-          </w:p>
-        </w:tc>
-        <w:tc>
-          <w:tcPr/>
-          <w:p>
-            <w:pPr>
-              <w:pStyle w:val="Compact"/>
-              <w:jc w:val="left"/>
-            </w:pPr>
-            <w:r>
-              <w:t xml:space="preserve">.022</w:t>
+              <w:t xml:space="preserve">2.62</w:t>
+            </w:r>
+          </w:p>
+        </w:tc>
+        <w:tc>
+          <w:tcPr/>
+          <w:p>
+            <w:pPr>
+              <w:pStyle w:val="Compact"/>
+              <w:jc w:val="left"/>
+            </w:pPr>
+            <w:r>
+              <w:t xml:space="preserve">.009</w:t>
             </w:r>
           </w:p>
         </w:tc>
@@ -11647,7 +11653,7 @@
               <w:jc w:val="left"/>
             </w:pPr>
             <w:r>
-              <w:t xml:space="preserve">1.16 [0.82, 1.51]</w:t>
+              <w:t xml:space="preserve">1.16 [0.81, 1.50]</w:t>
             </w:r>
           </w:p>
         </w:tc>
@@ -11671,7 +11677,7 @@
               <w:jc w:val="left"/>
             </w:pPr>
             <w:r>
-              <w:t xml:space="preserve">6.59</w:t>
+              <w:t xml:space="preserve">6.58</w:t>
             </w:r>
           </w:p>
         </w:tc>
@@ -11719,7 +11725,7 @@
               <w:jc w:val="left"/>
             </w:pPr>
             <w:r>
-              <w:t xml:space="preserve">15.02</w:t>
+              <w:t xml:space="preserve">15.01</w:t>
             </w:r>
           </w:p>
         </w:tc>
@@ -11781,19 +11787,19 @@
               <w:jc w:val="left"/>
             </w:pPr>
             <w:r>
-              <w:t xml:space="preserve">-0.13</w:t>
-            </w:r>
-          </w:p>
-        </w:tc>
-        <w:tc>
-          <w:tcPr/>
-          <w:p>
-            <w:pPr>
-              <w:pStyle w:val="Compact"/>
-              <w:jc w:val="left"/>
-            </w:pPr>
-            <w:r>
-              <w:t xml:space="preserve">.900</w:t>
+              <w:t xml:space="preserve">0.02</w:t>
+            </w:r>
+          </w:p>
+        </w:tc>
+        <w:tc>
+          <w:tcPr/>
+          <w:p>
+            <w:pPr>
+              <w:pStyle w:val="Compact"/>
+              <w:jc w:val="left"/>
+            </w:pPr>
+            <w:r>
+              <w:t xml:space="preserve">.981</w:t>
             </w:r>
           </w:p>
         </w:tc>
@@ -11829,19 +11835,19 @@
               <w:jc w:val="left"/>
             </w:pPr>
             <w:r>
-              <w:t xml:space="preserve">2.33</w:t>
-            </w:r>
-          </w:p>
-        </w:tc>
-        <w:tc>
-          <w:tcPr/>
-          <w:p>
-            <w:pPr>
-              <w:pStyle w:val="Compact"/>
-              <w:jc w:val="left"/>
-            </w:pPr>
-            <w:r>
-              <w:t xml:space="preserve">.023</w:t>
+              <w:t xml:space="preserve">2.30</w:t>
+            </w:r>
+          </w:p>
+        </w:tc>
+        <w:tc>
+          <w:tcPr/>
+          <w:p>
+            <w:pPr>
+              <w:pStyle w:val="Compact"/>
+              <w:jc w:val="left"/>
+            </w:pPr>
+            <w:r>
+              <w:t xml:space="preserve">.022</w:t>
             </w:r>
           </w:p>
         </w:tc>
@@ -11891,7 +11897,7 @@
               <w:jc w:val="left"/>
             </w:pPr>
             <w:r>
-              <w:t xml:space="preserve">-38.47</w:t>
+              <w:t xml:space="preserve">-38.30</w:t>
             </w:r>
           </w:p>
         </w:tc>
@@ -11939,7 +11945,7 @@
               <w:jc w:val="left"/>
             </w:pPr>
             <w:r>
-              <w:t xml:space="preserve">-47.92</w:t>
+              <w:t xml:space="preserve">-47.48</w:t>
             </w:r>
           </w:p>
         </w:tc>
@@ -12015,7 +12021,7 @@
               <w:jc w:val="left"/>
             </w:pPr>
             <w:r>
-              <w:t xml:space="preserve">-6.73</w:t>
+              <w:t xml:space="preserve">-6.26</w:t>
             </w:r>
           </w:p>
         </w:tc>
@@ -12039,7 +12045,7 @@
               <w:jc w:val="left"/>
             </w:pPr>
             <w:r>
-              <w:t xml:space="preserve">-0.01 [-0.01, 0.00]</w:t>
+              <w:t xml:space="preserve">-0.01 [-0.01, -0.01]</w:t>
             </w:r>
           </w:p>
         </w:tc>
@@ -12063,7 +12069,7 @@
               <w:jc w:val="left"/>
             </w:pPr>
             <w:r>
-              <w:t xml:space="preserve">-4.49</w:t>
+              <w:t xml:space="preserve">-4.59</w:t>
             </w:r>
           </w:p>
         </w:tc>
@@ -12142,19 +12148,19 @@
               <w:jc w:val="left"/>
             </w:pPr>
             <w:r>
-              <w:t xml:space="preserve">2.19</w:t>
-            </w:r>
-          </w:p>
-        </w:tc>
-        <w:tc>
-          <w:tcPr/>
-          <w:p>
-            <w:pPr>
-              <w:pStyle w:val="Compact"/>
-              <w:jc w:val="left"/>
-            </w:pPr>
-            <w:r>
-              <w:t xml:space="preserve">.029</w:t>
+              <w:t xml:space="preserve">2.05</w:t>
+            </w:r>
+          </w:p>
+        </w:tc>
+        <w:tc>
+          <w:tcPr/>
+          <w:p>
+            <w:pPr>
+              <w:pStyle w:val="Compact"/>
+              <w:jc w:val="left"/>
+            </w:pPr>
+            <w:r>
+              <w:t xml:space="preserve">.041</w:t>
             </w:r>
           </w:p>
         </w:tc>
@@ -12190,19 +12196,19 @@
               <w:jc w:val="left"/>
             </w:pPr>
             <w:r>
-              <w:t xml:space="preserve">-1.59</w:t>
-            </w:r>
-          </w:p>
-        </w:tc>
-        <w:tc>
-          <w:tcPr/>
-          <w:p>
-            <w:pPr>
-              <w:pStyle w:val="Compact"/>
-              <w:jc w:val="left"/>
-            </w:pPr>
-            <w:r>
-              <w:t xml:space="preserve">.114</w:t>
+              <w:t xml:space="preserve">-1.52</w:t>
+            </w:r>
+          </w:p>
+        </w:tc>
+        <w:tc>
+          <w:tcPr/>
+          <w:p>
+            <w:pPr>
+              <w:pStyle w:val="Compact"/>
+              <w:jc w:val="left"/>
+            </w:pPr>
+            <w:r>
+              <w:t xml:space="preserve">.128</w:t>
             </w:r>
           </w:p>
         </w:tc>
@@ -12283,19 +12289,19 @@
               <w:jc w:val="left"/>
             </w:pPr>
             <w:r>
-              <w:t xml:space="preserve">2.77</w:t>
-            </w:r>
-          </w:p>
-        </w:tc>
-        <w:tc>
-          <w:tcPr/>
-          <w:p>
-            <w:pPr>
-              <w:pStyle w:val="Compact"/>
-              <w:jc w:val="left"/>
-            </w:pPr>
-            <w:r>
-              <w:t xml:space="preserve">.006</w:t>
+              <w:t xml:space="preserve">2.66</w:t>
+            </w:r>
+          </w:p>
+        </w:tc>
+        <w:tc>
+          <w:tcPr/>
+          <w:p>
+            <w:pPr>
+              <w:pStyle w:val="Compact"/>
+              <w:jc w:val="left"/>
+            </w:pPr>
+            <w:r>
+              <w:t xml:space="preserve">.008</w:t>
             </w:r>
           </w:p>
         </w:tc>
@@ -12331,19 +12337,19 @@
               <w:jc w:val="left"/>
             </w:pPr>
             <w:r>
-              <w:t xml:space="preserve">1.03</w:t>
-            </w:r>
-          </w:p>
-        </w:tc>
-        <w:tc>
-          <w:tcPr/>
-          <w:p>
-            <w:pPr>
-              <w:pStyle w:val="Compact"/>
-              <w:jc w:val="left"/>
-            </w:pPr>
-            <w:r>
-              <w:t xml:space="preserve">.304</w:t>
+              <w:t xml:space="preserve">0.80</w:t>
+            </w:r>
+          </w:p>
+        </w:tc>
+        <w:tc>
+          <w:tcPr/>
+          <w:p>
+            <w:pPr>
+              <w:pStyle w:val="Compact"/>
+              <w:jc w:val="left"/>
+            </w:pPr>
+            <w:r>
+              <w:t xml:space="preserve">.423</w:t>
             </w:r>
           </w:p>
         </w:tc>
@@ -12471,7 +12477,7 @@
               <w:jc w:val="left"/>
             </w:pPr>
             <w:r>
-              <w:t xml:space="preserve">6.42</w:t>
+              <w:t xml:space="preserve">6.40</w:t>
             </w:r>
           </w:p>
         </w:tc>
@@ -12519,7 +12525,7 @@
               <w:jc w:val="left"/>
             </w:pPr>
             <w:r>
-              <w:t xml:space="preserve">14.47</w:t>
+              <w:t xml:space="preserve">14.48</w:t>
             </w:r>
           </w:p>
         </w:tc>
@@ -12581,7 +12587,7 @@
               <w:jc w:val="left"/>
             </w:pPr>
             <w:r>
-              <w:t xml:space="preserve">-20.95</w:t>
+              <w:t xml:space="preserve">-20.83</w:t>
             </w:r>
           </w:p>
         </w:tc>
@@ -12629,7 +12635,7 @@
               <w:jc w:val="left"/>
             </w:pPr>
             <w:r>
-              <w:t xml:space="preserve">-11.53</w:t>
+              <w:t xml:space="preserve">-11.37</w:t>
             </w:r>
           </w:p>
         </w:tc>
@@ -12691,7 +12697,7 @@
               <w:jc w:val="left"/>
             </w:pPr>
             <w:r>
-              <w:t xml:space="preserve">-39.55</w:t>
+              <w:t xml:space="preserve">-39.21</w:t>
             </w:r>
           </w:p>
         </w:tc>
@@ -12739,7 +12745,7 @@
               <w:jc w:val="left"/>
             </w:pPr>
             <w:r>
-              <w:t xml:space="preserve">-48.40</w:t>
+              <w:t xml:space="preserve">-47.94</w:t>
             </w:r>
           </w:p>
         </w:tc>
@@ -12815,7 +12821,7 @@
               <w:jc w:val="left"/>
             </w:pPr>
             <w:r>
-              <w:t xml:space="preserve">-7.92</w:t>
+              <w:t xml:space="preserve">-8.21</w:t>
             </w:r>
           </w:p>
         </w:tc>
@@ -12863,19 +12869,19 @@
               <w:jc w:val="left"/>
             </w:pPr>
             <w:r>
-              <w:t xml:space="preserve">-0.67</w:t>
-            </w:r>
-          </w:p>
-        </w:tc>
-        <w:tc>
-          <w:tcPr/>
-          <w:p>
-            <w:pPr>
-              <w:pStyle w:val="Compact"/>
-              <w:jc w:val="left"/>
-            </w:pPr>
-            <w:r>
-              <w:t xml:space="preserve">.506</w:t>
+              <w:t xml:space="preserve">-0.84</w:t>
+            </w:r>
+          </w:p>
+        </w:tc>
+        <w:tc>
+          <w:tcPr/>
+          <w:p>
+            <w:pPr>
+              <w:pStyle w:val="Compact"/>
+              <w:jc w:val="left"/>
+            </w:pPr>
+            <w:r>
+              <w:t xml:space="preserve">.398</w:t>
             </w:r>
           </w:p>
         </w:tc>
@@ -12942,7 +12948,7 @@
               <w:jc w:val="left"/>
             </w:pPr>
             <w:r>
-              <w:t xml:space="preserve">13.34</w:t>
+              <w:t xml:space="preserve">13.43</w:t>
             </w:r>
           </w:p>
         </w:tc>
@@ -12990,7 +12996,7 @@
               <w:jc w:val="left"/>
             </w:pPr>
             <w:r>
-              <w:t xml:space="preserve">9.48</w:t>
+              <w:t xml:space="preserve">9.46</w:t>
             </w:r>
           </w:p>
         </w:tc>
@@ -13083,7 +13089,7 @@
               <w:jc w:val="left"/>
             </w:pPr>
             <w:r>
-              <w:t xml:space="preserve">4.11</w:t>
+              <w:t xml:space="preserve">4.31</w:t>
             </w:r>
           </w:p>
         </w:tc>
@@ -13131,19 +13137,19 @@
               <w:jc w:val="left"/>
             </w:pPr>
             <w:r>
-              <w:t xml:space="preserve">0.03</w:t>
-            </w:r>
-          </w:p>
-        </w:tc>
-        <w:tc>
-          <w:tcPr/>
-          <w:p>
-            <w:pPr>
-              <w:pStyle w:val="Compact"/>
-              <w:jc w:val="left"/>
-            </w:pPr>
-            <w:r>
-              <w:t xml:space="preserve">.975</w:t>
+              <w:t xml:space="preserve">0.05</w:t>
+            </w:r>
+          </w:p>
+        </w:tc>
+        <w:tc>
+          <w:tcPr/>
+          <w:p>
+            <w:pPr>
+              <w:pStyle w:val="Compact"/>
+              <w:jc w:val="left"/>
+            </w:pPr>
+            <w:r>
+              <w:t xml:space="preserve">.963</w:t>
             </w:r>
           </w:p>
         </w:tc>
@@ -13247,7 +13253,7 @@
               <w:jc w:val="left"/>
             </w:pPr>
             <w:r>
-              <w:t xml:space="preserve">1.11 [0.77, 1.44]</w:t>
+              <w:t xml:space="preserve">1.10 [0.77, 1.44]</w:t>
             </w:r>
           </w:p>
         </w:tc>
@@ -13319,7 +13325,7 @@
               <w:jc w:val="left"/>
             </w:pPr>
             <w:r>
-              <w:t xml:space="preserve">15.33</w:t>
+              <w:t xml:space="preserve">15.35</w:t>
             </w:r>
           </w:p>
         </w:tc>
@@ -13381,7 +13387,7 @@
               <w:jc w:val="left"/>
             </w:pPr>
             <w:r>
-              <w:t xml:space="preserve">36.63</w:t>
+              <w:t xml:space="preserve">38.12</w:t>
             </w:r>
           </w:p>
         </w:tc>
@@ -13429,7 +13435,7 @@
               <w:jc w:val="left"/>
             </w:pPr>
             <w:r>
-              <w:t xml:space="preserve">29.40</w:t>
+              <w:t xml:space="preserve">28.26</w:t>
             </w:r>
           </w:p>
         </w:tc>
@@ -13491,7 +13497,7 @@
               <w:jc w:val="left"/>
             </w:pPr>
             <w:r>
-              <w:t xml:space="preserve">-36.44</w:t>
+              <w:t xml:space="preserve">-37.25</w:t>
             </w:r>
           </w:p>
         </w:tc>
@@ -13539,7 +13545,7 @@
               <w:jc w:val="left"/>
             </w:pPr>
             <w:r>
-              <w:t xml:space="preserve">-47.16</w:t>
+              <w:t xml:space="preserve">-46.89</w:t>
             </w:r>
           </w:p>
         </w:tc>
@@ -13591,6 +13597,54 @@
               <w:jc w:val="left"/>
             </w:pPr>
             <w:r>
+              <w:t xml:space="preserve">0.01 [0.00, 0.01]</w:t>
+            </w:r>
+          </w:p>
+        </w:tc>
+        <w:tc>
+          <w:tcPr/>
+          <w:p>
+            <w:pPr>
+              <w:pStyle w:val="Compact"/>
+              <w:jc w:val="left"/>
+            </w:pPr>
+            <w:r>
+              <w:t xml:space="preserve">0.00</w:t>
+            </w:r>
+          </w:p>
+        </w:tc>
+        <w:tc>
+          <w:tcPr/>
+          <w:p>
+            <w:pPr>
+              <w:pStyle w:val="Compact"/>
+              <w:jc w:val="left"/>
+            </w:pPr>
+            <w:r>
+              <w:t xml:space="preserve">2.12</w:t>
+            </w:r>
+          </w:p>
+        </w:tc>
+        <w:tc>
+          <w:tcPr/>
+          <w:p>
+            <w:pPr>
+              <w:pStyle w:val="Compact"/>
+              <w:jc w:val="left"/>
+            </w:pPr>
+            <w:r>
+              <w:t xml:space="preserve">.034</w:t>
+            </w:r>
+          </w:p>
+        </w:tc>
+        <w:tc>
+          <w:tcPr/>
+          <w:p>
+            <w:pPr>
+              <w:pStyle w:val="Compact"/>
+              <w:jc w:val="left"/>
+            </w:pPr>
+            <w:r>
               <w:t xml:space="preserve">0.00 [0.00, 0.01]</w:t>
             </w:r>
           </w:p>
@@ -13615,67 +13669,19 @@
               <w:jc w:val="left"/>
             </w:pPr>
             <w:r>
-              <w:t xml:space="preserve">1.86</w:t>
-            </w:r>
-          </w:p>
-        </w:tc>
-        <w:tc>
-          <w:tcPr/>
-          <w:p>
-            <w:pPr>
-              <w:pStyle w:val="Compact"/>
-              <w:jc w:val="left"/>
-            </w:pPr>
-            <w:r>
-              <w:t xml:space="preserve">.070</w:t>
-            </w:r>
-          </w:p>
-        </w:tc>
-        <w:tc>
-          <w:tcPr/>
-          <w:p>
-            <w:pPr>
-              <w:pStyle w:val="Compact"/>
-              <w:jc w:val="left"/>
-            </w:pPr>
-            <w:r>
-              <w:t xml:space="preserve">0.00 [0.00, 0.01]</w:t>
-            </w:r>
-          </w:p>
-        </w:tc>
-        <w:tc>
-          <w:tcPr/>
-          <w:p>
-            <w:pPr>
-              <w:pStyle w:val="Compact"/>
-              <w:jc w:val="left"/>
-            </w:pPr>
-            <w:r>
-              <w:t xml:space="preserve">0.00</w:t>
-            </w:r>
-          </w:p>
-        </w:tc>
-        <w:tc>
-          <w:tcPr/>
-          <w:p>
-            <w:pPr>
-              <w:pStyle w:val="Compact"/>
-              <w:jc w:val="left"/>
-            </w:pPr>
-            <w:r>
-              <w:t xml:space="preserve">0.44</w:t>
-            </w:r>
-          </w:p>
-        </w:tc>
-        <w:tc>
-          <w:tcPr/>
-          <w:p>
-            <w:pPr>
-              <w:pStyle w:val="Compact"/>
-              <w:jc w:val="left"/>
-            </w:pPr>
-            <w:r>
-              <w:t xml:space="preserve">.659</w:t>
+              <w:t xml:space="preserve">0.62</w:t>
+            </w:r>
+          </w:p>
+        </w:tc>
+        <w:tc>
+          <w:tcPr/>
+          <w:p>
+            <w:pPr>
+              <w:pStyle w:val="Compact"/>
+              <w:jc w:val="left"/>
+            </w:pPr>
+            <w:r>
+              <w:t xml:space="preserve">.536</w:t>
             </w:r>
           </w:p>
         </w:tc>
@@ -13742,7 +13748,7 @@
               <w:jc w:val="left"/>
             </w:pPr>
             <w:r>
-              <w:t xml:space="preserve">-19.43</w:t>
+              <w:t xml:space="preserve">-19.27</w:t>
             </w:r>
           </w:p>
         </w:tc>
@@ -13790,7 +13796,7 @@
               <w:jc w:val="left"/>
             </w:pPr>
             <w:r>
-              <w:t xml:space="preserve">-17.15</w:t>
+              <w:t xml:space="preserve">-18.06</w:t>
             </w:r>
           </w:p>
         </w:tc>
@@ -13883,19 +13889,19 @@
               <w:jc w:val="left"/>
             </w:pPr>
             <w:r>
-              <w:t xml:space="preserve">-1.04</w:t>
-            </w:r>
-          </w:p>
-        </w:tc>
-        <w:tc>
-          <w:tcPr/>
-          <w:p>
-            <w:pPr>
-              <w:pStyle w:val="Compact"/>
-              <w:jc w:val="left"/>
-            </w:pPr>
-            <w:r>
-              <w:t xml:space="preserve">.316</w:t>
+              <w:t xml:space="preserve">-1.23</w:t>
+            </w:r>
+          </w:p>
+        </w:tc>
+        <w:tc>
+          <w:tcPr/>
+          <w:p>
+            <w:pPr>
+              <w:pStyle w:val="Compact"/>
+              <w:jc w:val="left"/>
+            </w:pPr>
+            <w:r>
+              <w:t xml:space="preserve">.218</w:t>
             </w:r>
           </w:p>
         </w:tc>
@@ -13931,19 +13937,19 @@
               <w:jc w:val="left"/>
             </w:pPr>
             <w:r>
-              <w:t xml:space="preserve">-0.16</w:t>
-            </w:r>
-          </w:p>
-        </w:tc>
-        <w:tc>
-          <w:tcPr/>
-          <w:p>
-            <w:pPr>
-              <w:pStyle w:val="Compact"/>
-              <w:jc w:val="left"/>
-            </w:pPr>
-            <w:r>
-              <w:t xml:space="preserve">.871</w:t>
+              <w:t xml:space="preserve">-0.85</w:t>
+            </w:r>
+          </w:p>
+        </w:tc>
+        <w:tc>
+          <w:tcPr/>
+          <w:p>
+            <w:pPr>
+              <w:pStyle w:val="Compact"/>
+              <w:jc w:val="left"/>
+            </w:pPr>
+            <w:r>
+              <w:t xml:space="preserve">.396</w:t>
             </w:r>
           </w:p>
         </w:tc>
@@ -13984,12 +13990,12 @@
           <wp:inline>
             <wp:extent cx="6565900" cy="2625618"/>
             <wp:effectExtent b="0" l="0" r="0" t="0"/>
-            <wp:docPr descr="Figure 3: Physical activity predicted by previous night sleep duration. The panels on the left show the curvilinear relationship between sleep duration and each of the physical activity outcomes at the ages indicated in each column. The panels on the right show the same relationships but by age continuously. The white band indicates predictions which were not significantly different from zero." title="" id="46" name="Picture"/>
+            <wp:docPr descr="Figure 3: Physical activity is predicted by the duration of sleep the previous night. The panels on the left show the curvilinear relationship between sleep duration and the physical activity outcomes at the ages indicated in each column. The panels on the right show the same relationships but by age continuously. The white band indicates predictions which were not significantly different from zero." title="" id="46" name="Picture"/>
             <a:graphic>
               <a:graphicData uri="http://schemas.openxmlformats.org/drawingml/2006/picture">
                 <pic:pic>
                   <pic:nvPicPr>
-                    <pic:cNvPr descr="manuscript_files/e926c728da8a54f7b8f1d0d35a982108b6410221.jpg" id="47" name="Picture"/>
+                    <pic:cNvPr descr="manuscript_files/24ed2b450c66833b89ad9ae1283b556762b3ebe0.jpg" id="47" name="Picture"/>
                     <pic:cNvPicPr>
                       <a:picLocks noChangeArrowheads="1" noChangeAspect="1"/>
                     </pic:cNvPicPr>
@@ -14039,17 +14045,17 @@
         <w:t xml:space="preserve"> </w:t>
       </w:r>
       <w:r>
-        <w:t xml:space="preserve">3. Physical activity predicted by previous night sleep duration. The panels on the left show the curvilinear relationship between sleep duration and each of the physical activity outcomes at the ages indicated in each column. The panels on the right show the same relationships but by age continuously. The white band indicates predictions which were not significantly different from zero.</w:t>
+        <w:t xml:space="preserve">3. Physical activity is predicted by the duration of sleep the previous night. The panels on the left show the curvilinear relationship between sleep duration and the physical activity outcomes at the ages indicated in each column. The panels on the right show the same relationships but by age continuously. The white band indicates predictions which were not significantly different from zero.</w:t>
       </w:r>
     </w:p>
     <w:bookmarkEnd w:id="49"/>
-    <w:bookmarkStart w:id="54" w:name="X4f938f992ae8f586cf755ad0143b241d25fead3"/>
+    <w:bookmarkStart w:id="54" w:name="Xddb7dd385d9dcfb042bacd1da9891f05b307b0e"/>
     <w:p>
       <w:pPr>
         <w:pStyle w:val="berschrift2"/>
       </w:pPr>
       <w:r>
-        <w:t xml:space="preserve">The effects of sleep efficiency on physical activity</w:t>
+        <w:t xml:space="preserve">The association between sleep efficiency and physical activity</w:t>
       </w:r>
     </w:p>
     <w:p>
@@ -14057,7 +14063,7 @@
         <w:pStyle w:val="FirstParagraph"/>
       </w:pPr>
       <w:r>
-        <w:t xml:space="preserve">We estimated the effect of sleep efficiency on physical activity by age.</w:t>
+        <w:t xml:space="preserve">We estimated the association between sleep efficiency and physical activity by age.</w:t>
       </w:r>
       <w:r>
         <w:t xml:space="preserve"> </w:t>
@@ -14090,7 +14096,7 @@
         <w:t xml:space="preserve"> </w:t>
       </w:r>
       <w:r>
-        <w:t xml:space="preserve">There was a negligible relationship between sleep efficiency and physical activity volume and a weak linear association between sleep efficiency and more intense physical activity.</w:t>
+        <w:t xml:space="preserve">There was a negligible positive association between sleep efficiency and physical activity volume and a weak linear association between sleep efficiency and more intense physical activity.</w:t>
       </w:r>
     </w:p>
     <w:p>
@@ -14107,7 +14113,7 @@
               <a:graphicData uri="http://schemas.openxmlformats.org/drawingml/2006/picture">
                 <pic:pic>
                   <pic:nvPicPr>
-                    <pic:cNvPr descr="manuscript_files/1ddd076fa18705bedf8410000914d59556a3441d.jpg" id="52" name="Picture"/>
+                    <pic:cNvPr descr="manuscript_files/7a32a8a557d6344833ae69adf2e33513239fb994.jpg" id="52" name="Picture"/>
                     <pic:cNvPicPr>
                       <a:picLocks noChangeArrowheads="1" noChangeAspect="1"/>
                     </pic:cNvPicPr>
@@ -14161,13 +14167,13 @@
       </w:r>
     </w:p>
     <w:bookmarkEnd w:id="54"/>
-    <w:bookmarkStart w:id="59" w:name="X1f81d2ba0159bcbfb61758cd80661e798901b57"/>
+    <w:bookmarkStart w:id="59" w:name="X3d07e254f7469e201e1728973236eeabe791b2b"/>
     <w:p>
       <w:pPr>
         <w:pStyle w:val="berschrift2"/>
       </w:pPr>
       <w:r>
-        <w:t xml:space="preserve">The effects of sleep onset on physical activity</w:t>
+        <w:t xml:space="preserve">The association between sleep onset and physical activity</w:t>
       </w:r>
     </w:p>
     <w:p>
@@ -14175,7 +14181,7 @@
         <w:pStyle w:val="FirstParagraph"/>
       </w:pPr>
       <w:r>
-        <w:t xml:space="preserve">We estimated the effect of sleep onset on physical activity by age.</w:t>
+        <w:t xml:space="preserve">We estimated the association between sleep onset and physical activity by age.</w:t>
       </w:r>
       <w:r>
         <w:t xml:space="preserve"> </w:t>
@@ -14208,7 +14214,7 @@
         <w:t xml:space="preserve"> </w:t>
       </w:r>
       <w:r>
-        <w:t xml:space="preserve">There were weak curvilinear relationships where average sleep onset was linked to the highest levels of physical activity volume, but not intensity.</w:t>
+        <w:t xml:space="preserve">There were weak curvilinear relationships where average sleep onset was linked to the highest levels of physical activity volume but not intensity.</w:t>
       </w:r>
     </w:p>
     <w:p>
@@ -14225,7 +14231,7 @@
               <a:graphicData uri="http://schemas.openxmlformats.org/drawingml/2006/picture">
                 <pic:pic>
                   <pic:nvPicPr>
-                    <pic:cNvPr descr="manuscript_files/d16c8bf323cfa7af8a4b5fc887cc14e96fad8f22.jpg" id="57" name="Picture"/>
+                    <pic:cNvPr descr="manuscript_files/ebc74d085975779f4ee21f68ed3795dceeba30f0.jpg" id="57" name="Picture"/>
                     <pic:cNvPicPr>
                       <a:picLocks noChangeArrowheads="1" noChangeAspect="1"/>
                     </pic:cNvPicPr>
@@ -14279,13 +14285,13 @@
       </w:r>
     </w:p>
     <w:bookmarkEnd w:id="59"/>
-    <w:bookmarkStart w:id="64" w:name="X5a2a01188f3a4beede9359d895f20f75d3e9c49"/>
+    <w:bookmarkStart w:id="64" w:name="X6e3c3bb6f32c96f8b108022a638b3a7462e6e7f"/>
     <w:p>
       <w:pPr>
         <w:pStyle w:val="berschrift2"/>
       </w:pPr>
       <w:r>
-        <w:t xml:space="preserve">The effects of sleep regularity on physical activity</w:t>
+        <w:t xml:space="preserve">The association between sleep regularity and physical activity</w:t>
       </w:r>
     </w:p>
     <w:p>
@@ -14293,7 +14299,7 @@
         <w:pStyle w:val="FirstParagraph"/>
       </w:pPr>
       <w:r>
-        <w:t xml:space="preserve">We estimated the effect of sleep regularity on physical activity by age.</w:t>
+        <w:t xml:space="preserve">We estimated the association between sleep regularity and physical activity by age.</w:t>
       </w:r>
       <w:r>
         <w:t xml:space="preserve"> </w:t>
@@ -14332,7 +14338,7 @@
         <w:t xml:space="preserve"> </w:t>
       </w:r>
       <w:r>
-        <w:t xml:space="preserve">These relationships were slightly attenuated with age, such that for older adults the effect was negligible.</w:t>
+        <w:t xml:space="preserve">These relationships were slightly attenuated with age, such that for older adults the effect size was negligible.</w:t>
       </w:r>
     </w:p>
     <w:p>
@@ -14349,7 +14355,7 @@
               <a:graphicData uri="http://schemas.openxmlformats.org/drawingml/2006/picture">
                 <pic:pic>
                   <pic:nvPicPr>
-                    <pic:cNvPr descr="manuscript_files/0a8b5766b7c8193417494101a27fd15dd93fc04a.jpg" id="62" name="Picture"/>
+                    <pic:cNvPr descr="manuscript_files/8cf74803e6acb82743db245e457f5478948c7f84.jpg" id="62" name="Picture"/>
                     <pic:cNvPicPr>
                       <a:picLocks noChangeArrowheads="1" noChangeAspect="1"/>
                     </pic:cNvPicPr>
@@ -14418,19 +14424,25 @@
         <w:pStyle w:val="FirstParagraph"/>
       </w:pPr>
       <w:r>
-        <w:t xml:space="preserve">In this study, we collated and harmonised device-measured physical activity and sleep data from 20 studies around the world, covering participants across the lifespan.</w:t>
-      </w:r>
-      <w:r>
-        <w:t xml:space="preserve"> </w:t>
-      </w:r>
-      <w:r>
-        <w:t xml:space="preserve">We found that both the volume and intensity of physical activity was associated with longer sleep duration, higher sleep efficiency, earlier sleep onset, and more regular sleep.</w:t>
-      </w:r>
-      <w:r>
-        <w:t xml:space="preserve"> </w:t>
-      </w:r>
-      <w:r>
-        <w:t xml:space="preserve">These relationships were the strongest for sleep regularity, although the the relationship between physical activity intensity weakened with age.</w:t>
+        <w:t xml:space="preserve">In this study, we collated and harmonised accelerometer-assessed physical activity and sleep data from 20 studies around the world, covering participants across the lifespan.</w:t>
+      </w:r>
+      <w:r>
+        <w:t xml:space="preserve"> </w:t>
+      </w:r>
+      <w:r>
+        <w:t xml:space="preserve">We found that both the volume and intensity of physical activity were associated with longer sleep duration, higher sleep efficiency, earlier sleep onset, and more regular sleep.</w:t>
+      </w:r>
+      <w:r>
+        <w:t xml:space="preserve"> </w:t>
+      </w:r>
+      <w:r>
+        <w:t xml:space="preserve">These relationships were the strongest for sleep regularity, although the relationship with physical activity intensity weakened with age.</w:t>
+      </w:r>
+      <w:r>
+        <w:t xml:space="preserve"> </w:t>
+      </w:r>
+      <w:r>
+        <w:t xml:space="preserve">Although robust, these associations were small: changes of 1 SD in the physical activity metrics were associated with an average of &lt;– TODO –&gt; SD in the sleep metrics.</w:t>
       </w:r>
     </w:p>
     <w:p>
@@ -14438,7 +14450,7 @@
         <w:pStyle w:val="Textkrper"/>
       </w:pPr>
       <w:r>
-        <w:t xml:space="preserve">When examining the reverse direction, we observed those who fell asleep earlier and at a more regular time engaged in more total physical activity, with an additional negligible benefit for those who slept more efficiently.</w:t>
+        <w:t xml:space="preserve">When examining the reverse direction, we observed that those who fell asleep earlier or at a more regular time engaged in more total physical activity, with an additional negligible benefit for those who slept more efficiently.</w:t>
       </w:r>
       <w:r>
         <w:t xml:space="preserve"> </w:t>
@@ -14450,7 +14462,7 @@
         <w:t xml:space="preserve"> </w:t>
       </w:r>
       <w:r>
-        <w:t xml:space="preserve">These findings were largely robust to the decisions made during analysis (see supplementary materials for all analyses).</w:t>
+        <w:t xml:space="preserve">Our sensitivity analyses suggest that these findings were largely robust to the decisions made during analysis.</w:t>
       </w:r>
     </w:p>
     <w:p>
@@ -14495,16 +14507,7 @@
           <m:rPr>
             <m:sty m:val="p"/>
           </m:rPr>
-          <m:t>&lt;</m:t>
-        </m:r>
-        <m:r>
-          <m:t>d</m:t>
-        </m:r>
-        <m:r>
-          <m:rPr>
-            <m:sty m:val="p"/>
-          </m:rPr>
-          <m:t>&lt;</m:t>
+          <m:t>−</m:t>
         </m:r>
         <m:r>
           <m:t>0.30</m:t>
@@ -14547,7 +14550,7 @@
         <w:t xml:space="preserve"> </w:t>
       </w:r>
       <w:r>
-        <w:t xml:space="preserve">It could also be that duration of sleep is set more by parameters external to the individual, such as work schedules or parenting duties, than by individual health behaviours.</w:t>
+        <w:t xml:space="preserve">It is important to note that sleep duration will sometimes be influenced by parameters external to the individual, such as work or school schedules or parenting duties, rather than by individual health behaviours.</w:t>
       </w:r>
     </w:p>
     <w:p>
@@ -14599,7 +14602,7 @@
         <w:pStyle w:val="Textkrper"/>
       </w:pPr>
       <w:r>
-        <w:t xml:space="preserve">Contrary to expectations, we found little evidence to suggest that the associations between physical activity and sleep differed by age.</w:t>
+        <w:t xml:space="preserve">Contrary to expectations, we found little evidence to suggest that the associations of physical activity with next day sleep differed by age.</w:t>
       </w:r>
       <w:r>
         <w:t xml:space="preserve"> </w:t>
@@ -14611,7 +14614,7 @@
         <w:t xml:space="preserve"> </w:t>
       </w:r>
       <w:r>
-        <w:t xml:space="preserve">This suggests that the benefits of physical activity and sleep are consistent across the lifespan, which is inconsistent with previous meta-analyses conducted on different ages.</w:t>
+        <w:t xml:space="preserve">This suggests that the interrelationship between physical activity and sleep are consistent across the lifespan, which is inconsistent with previous meta-analyses conducted on different ages.</w:t>
       </w:r>
       <w:r>
         <w:t xml:space="preserve"> </w:t>
@@ -14664,13 +14667,13 @@
         <w:t xml:space="preserve"> </w:t>
       </w:r>
       <w:r>
-        <w:t xml:space="preserve">Our results support encouraging physical activity for maintaining regular sleep patterns across the lifespan.</w:t>
-      </w:r>
-      <w:r>
-        <w:t xml:space="preserve"> </w:t>
-      </w:r>
-      <w:r>
-        <w:t xml:space="preserve">Sleep health may contribute to overall better health outcomes</w:t>
+        <w:t xml:space="preserve">Our results support promotioning physical activity as a strategy for maintaining regular sleep patterns across the lifespan.</w:t>
+      </w:r>
+      <w:r>
+        <w:t xml:space="preserve"> </w:t>
+      </w:r>
+      <w:r>
+        <w:t xml:space="preserve">Given the well-established links between sleep and overall health</w:t>
       </w:r>
       <w:r>
         <w:t xml:space="preserve"> </w:t>
@@ -14679,31 +14682,31 @@
         <w:t xml:space="preserve">[2,3]</w:t>
       </w:r>
       <w:r>
-        <w:t xml:space="preserve">, and so promoting physical activity may be a useful strategy for improving population health.</w:t>
-      </w:r>
-      <w:r>
-        <w:t xml:space="preserve"> </w:t>
-      </w:r>
-      <w:r>
-        <w:t xml:space="preserve">Public health messages should, therefore, emphasise the role of physical activity in promoting stable sleep schedules rather than framing physical activity as a universal solution for improving sleep.</w:t>
-      </w:r>
-      <w:r>
-        <w:t xml:space="preserve"> </w:t>
-      </w:r>
-      <w:r>
-        <w:t xml:space="preserve">We note, however, that we did not examine the these relationships in individuals with sleep disorders or other health conditions.</w:t>
-      </w:r>
-      <w:r>
-        <w:t xml:space="preserve"> </w:t>
-      </w:r>
-      <w:r>
-        <w:t xml:space="preserve">Physical activity interventions may still be a useful treatment for these conditions.</w:t>
-      </w:r>
-      <w:r>
-        <w:t xml:space="preserve"> </w:t>
-      </w:r>
-      <w:r>
-        <w:t xml:space="preserve">Promoting more regular sleep may also be a useful strategy for increasing physical activity, although our results suggest a limited benefit from targeting other aspects of sleep quality.</w:t>
+        <w:t xml:space="preserve">, incorporating physical activity into public health messaging may have downstream benefits for population health.</w:t>
+      </w:r>
+      <w:r>
+        <w:t xml:space="preserve"> </w:t>
+      </w:r>
+      <w:r>
+        <w:t xml:space="preserve">However, our findings suggest that physical activity is not a universal solution for improving all aspects of sleep.</w:t>
+      </w:r>
+      <w:r>
+        <w:t xml:space="preserve"> </w:t>
+      </w:r>
+      <w:r>
+        <w:t xml:space="preserve">Public health messages should, therefore, emphasise the role of physical activity in promoting consistent sleep schedules rather than framing physical activity as a universal solution for improving sleep.</w:t>
+      </w:r>
+      <w:r>
+        <w:t xml:space="preserve"> </w:t>
+      </w:r>
+      <w:r>
+        <w:t xml:space="preserve">Additionally, we did not examine these relationships specifically in individuals with sleep disorders or other health conditions, where the effects of physical activity may differ.</w:t>
+      </w:r>
+      <w:r>
+        <w:t xml:space="preserve"> </w:t>
+      </w:r>
+      <w:r>
+        <w:t xml:space="preserve">Future research should explore whether targeting sleep regularity through physical activity interventions can provide meaningful health benefits beyond sleep itself.</w:t>
       </w:r>
     </w:p>
     <w:p>
@@ -14711,7 +14714,7 @@
         <w:pStyle w:val="Textkrper"/>
       </w:pPr>
       <w:r>
-        <w:t xml:space="preserve">Our study has several strengths, including the use of device-based measures, which reduce the bias associated with self-reported sleep and activity data, and the harmonisation of individual data from multiple studies, conducted in geographically diverse regions and among multiple age groups, allowing for robust and generalisable findings.</w:t>
+        <w:t xml:space="preserve">Our study has several strengths, including the use of accelerometer-assessed measures, which reduce the bias associated with self-reported sleep and activity data, and the harmonisation of individual data from multiple studies, conducted in geographically diverse regions and among multiple age groups, allowing for robust and generalisable findings.</w:t>
       </w:r>
       <w:r>
         <w:t xml:space="preserve"> </w:t>
@@ -14772,21 +14775,6 @@
       </w:r>
       <w:r>
         <w:t xml:space="preserve">Additionally, although we controlled for several potential confounders, there may still be unmeasured factors affecting the observed associations.</w:t>
-      </w:r>
-      <w:r>
-        <w:t xml:space="preserve"> </w:t>
-      </w:r>
-      <w:r>
-        <w:t xml:space="preserve"> </w:t>
-      </w:r>
-      <w:r>
-        <w:t xml:space="preserve">Our imputation model included study, but not the remaining moderators or their interactions with physical activity and sleep.</w:t>
-      </w:r>
-      <w:r>
-        <w:t xml:space="preserve"> </w:t>
-      </w:r>
-      <w:r>
-        <w:t xml:space="preserve">It is therefore uncongenial with the analysis models, and moderator effects may be attenuated towards the null as a result.</w:t>
       </w:r>
       <w:r>
         <w:t xml:space="preserve"> </w:t>
@@ -14825,19 +14813,43 @@
         <w:pStyle w:val="FirstParagraph"/>
       </w:pPr>
       <w:r>
-        <w:t xml:space="preserve">Our findings contribute to the growing body of literature that highlights the complex relationship between physical activity and sleep.</w:t>
-      </w:r>
-      <w:r>
-        <w:t xml:space="preserve"> </w:t>
-      </w:r>
-      <w:r>
-        <w:t xml:space="preserve">While physical activity appears to benefit sleep regularity, its effects on other sleep metrics are less clear, particularly when considering age differences.</w:t>
-      </w:r>
-      <w:r>
-        <w:t xml:space="preserve"> </w:t>
-      </w:r>
-      <w:r>
-        <w:t xml:space="preserve">Future research should aim to explore mechanisms underlying these associations and identify specific intervention strategies that can effectively enhance both sleep and physical activity behaviours for diverse populations.</w:t>
+        <w:t xml:space="preserve">Our study provides new insights into the relationship between physical activity and sleep across the lifespan using a large, globally diverse dataset with device-based measurements.</w:t>
+      </w:r>
+      <w:r>
+        <w:t xml:space="preserve"> </w:t>
+      </w:r>
+      <w:r>
+        <w:t xml:space="preserve">We found that physical activity was most consistently associated with sleep regularity, with weaker and less consistent associations observed for sleep duration, efficiency, and onset.</w:t>
+      </w:r>
+      <w:r>
+        <w:t xml:space="preserve"> </w:t>
+      </w:r>
+      <w:r>
+        <w:t xml:space="preserve">Additionally, our analyses revealed beneficial associations, where higher physical activity levels were associated with greater sleep regularity, and more regular sleep patterns predicted higher physical activity the following day.</w:t>
+      </w:r>
+      <w:r>
+        <w:t xml:space="preserve"> </w:t>
+      </w:r>
+      <w:r>
+        <w:t xml:space="preserve">However, this bidirectional association was attenuated in older adults, suggesting that the interplay between sleep and physical activity may change with age.</w:t>
+      </w:r>
+      <w:r>
+        <w:t xml:space="preserve"> </w:t>
+      </w:r>
+      <w:r>
+        <w:t xml:space="preserve">Findings suggest that public health efforts to promote physical activity may be particularly valuable for improving sleep consistency rather than sleep duration or efficiency.</w:t>
+      </w:r>
+      <w:r>
+        <w:t xml:space="preserve"> </w:t>
+      </w:r>
+      <w:r>
+        <w:t xml:space="preserve">While physical activity is unlikely to be a universal solution for sleep improvement, encouraging regular movement could support stable sleep patterns, which are increasingly recognized as a key determinant of overall health.</w:t>
+      </w:r>
+      <w:r>
+        <w:t xml:space="preserve"> </w:t>
+      </w:r>
+      <w:r>
+        <w:t xml:space="preserve">Future research should explore how targeted interventions—particularly those addressing sleep regularity—may enhance both sleep and physical activity behaviours across different age groups and populations.</w:t>
       </w:r>
     </w:p>
     <w:p>

</xml_diff>

<commit_message>
Switch to The Lancet citation style
</commit_message>
<xml_diff>
--- a/doc/manuscript.docx
+++ b/doc/manuscript.docx
@@ -9485,7 +9485,7 @@
           <w:i/>
           <w:iCs/>
         </w:rPr>
-        <w:t xml:space="preserve">Journal of Clinical Sleep Medicine</w:t>
+        <w:t xml:space="preserve">J Clin Sleep Med</w:t>
       </w:r>
       <w:r>
         <w:t xml:space="preserve"> </w:t>
@@ -9547,7 +9547,7 @@
           <w:i/>
           <w:iCs/>
         </w:rPr>
-        <w:t xml:space="preserve">British Journal of Sports Medicine</w:t>
+        <w:t xml:space="preserve">Br J Sports Med</w:t>
       </w:r>
       <w:r>
         <w:t xml:space="preserve"> </w:t>
@@ -9671,7 +9671,7 @@
           <w:i/>
           <w:iCs/>
         </w:rPr>
-        <w:t xml:space="preserve">Journal of the American Heart Association</w:t>
+        <w:t xml:space="preserve">J Am Heart Assoc</w:t>
       </w:r>
       <w:r>
         <w:t xml:space="preserve"> </w:t>
@@ -9744,7 +9744,7 @@
           <w:i/>
           <w:iCs/>
         </w:rPr>
-        <w:t xml:space="preserve">Sleep Medicine</w:t>
+        <w:t xml:space="preserve">Sleep Med</w:t>
       </w:r>
       <w:r>
         <w:t xml:space="preserve"> </w:t>
@@ -9806,7 +9806,7 @@
           <w:i/>
           <w:iCs/>
         </w:rPr>
-        <w:t xml:space="preserve">British Journal of Health Psychology</w:t>
+        <w:t xml:space="preserve">Br J Health Psychol</w:t>
       </w:r>
       <w:r>
         <w:t xml:space="preserve"> </w:t>
@@ -9980,7 +9980,7 @@
           <w:i/>
           <w:iCs/>
         </w:rPr>
-        <w:t xml:space="preserve">Journal of Adolescent Health</w:t>
+        <w:t xml:space="preserve">J Adolesc Health</w:t>
       </w:r>
       <w:r>
         <w:t xml:space="preserve"> </w:t>
@@ -10018,7 +10018,28 @@
         <w:t xml:space="preserve">	</w:t>
       </w:r>
       <w:r>
-        <w:t xml:space="preserve">Ng AE, Black LI, Adjaye-Gbewonyo D. Short sleep duration and sleep difficulties among adults:</w:t>
+        <w:t xml:space="preserve">Ng AE, Black LI, Adjaye-Gbewonyo D. Short</w:t>
+      </w:r>
+      <w:r>
+        <w:t xml:space="preserve"> </w:t>
+      </w:r>
+      <w:r>
+        <w:t xml:space="preserve">Sleep Duration</w:t>
+      </w:r>
+      <w:r>
+        <w:t xml:space="preserve"> </w:t>
+      </w:r>
+      <w:r>
+        <w:t xml:space="preserve">and</w:t>
+      </w:r>
+      <w:r>
+        <w:t xml:space="preserve"> </w:t>
+      </w:r>
+      <w:r>
+        <w:t xml:space="preserve">Sleep Difficulties Among Adults</w:t>
+      </w:r>
+      <w:r>
+        <w:t xml:space="preserve">:</w:t>
       </w:r>
       <w:r>
         <w:t xml:space="preserve"> </w:t>
@@ -10027,7 +10048,7 @@
         <w:t xml:space="preserve">United States</w:t>
       </w:r>
       <w:r>
-        <w:t xml:space="preserve">, 2024. Hyattsville, MD: National Center for Health Statistics, 2026 DOI:</w:t>
+        <w:t xml:space="preserve">, 2024. National Center for Health Statistics (U.S.), 2026 DOI:</w:t>
       </w:r>
       <w:hyperlink r:id="rId60">
         <w:r>
@@ -10295,7 +10316,7 @@
           <w:i/>
           <w:iCs/>
         </w:rPr>
-        <w:t xml:space="preserve">The Lancet Public Health</w:t>
+        <w:t xml:space="preserve">Lancet Public Health</w:t>
       </w:r>
       <w:r>
         <w:t xml:space="preserve"> </w:t>
@@ -10415,7 +10436,7 @@
           <w:i/>
           <w:iCs/>
         </w:rPr>
-        <w:t xml:space="preserve">Sleep Medicine Reviews</w:t>
+        <w:t xml:space="preserve">Sleep Med Rev</w:t>
       </w:r>
       <w:r>
         <w:t xml:space="preserve"> </w:t>
@@ -10477,7 +10498,7 @@
           <w:i/>
           <w:iCs/>
         </w:rPr>
-        <w:t xml:space="preserve">Journal of Behavioral Medicine</w:t>
+        <w:t xml:space="preserve">J Behav Med</w:t>
       </w:r>
       <w:r>
         <w:t xml:space="preserve"> </w:t>
@@ -10573,7 +10594,7 @@
           <w:i/>
           <w:iCs/>
         </w:rPr>
-        <w:t xml:space="preserve">Sleep Medicine Reviews</w:t>
+        <w:t xml:space="preserve">Sleep Med Rev</w:t>
       </w:r>
       <w:r>
         <w:t xml:space="preserve"> </w:t>
@@ -10645,7 +10666,7 @@
           <w:i/>
           <w:iCs/>
         </w:rPr>
-        <w:t xml:space="preserve">BMC Geriatrics</w:t>
+        <w:t xml:space="preserve">BMC Geriatr</w:t>
       </w:r>
       <w:r>
         <w:t xml:space="preserve"> </w:t>
@@ -10741,7 +10762,7 @@
           <w:i/>
           <w:iCs/>
         </w:rPr>
-        <w:t xml:space="preserve">British Journal of Sports Medicine</w:t>
+        <w:t xml:space="preserve">Br J Sports Med</w:t>
       </w:r>
       <w:r>
         <w:t xml:space="preserve"> </w:t>
@@ -10837,7 +10858,7 @@
           <w:i/>
           <w:iCs/>
         </w:rPr>
-        <w:t xml:space="preserve">Sleep Medicine Reviews</w:t>
+        <w:t xml:space="preserve">Sleep Med Rev</w:t>
       </w:r>
       <w:r>
         <w:t xml:space="preserve"> </w:t>
@@ -10923,7 +10944,7 @@
           <w:i/>
           <w:iCs/>
         </w:rPr>
-        <w:t xml:space="preserve">Sleep Medicine Reviews</w:t>
+        <w:t xml:space="preserve">Sleep Med Rev</w:t>
       </w:r>
       <w:r>
         <w:t xml:space="preserve"> </w:t>
@@ -10995,7 +11016,7 @@
           <w:i/>
           <w:iCs/>
         </w:rPr>
-        <w:t xml:space="preserve">European Child &amp; Adolescent Psychiatry</w:t>
+        <w:t xml:space="preserve">Eur Child Adolesc Psychiatry</w:t>
       </w:r>
       <w:r>
         <w:t xml:space="preserve"> </w:t>
@@ -11067,7 +11088,7 @@
           <w:i/>
           <w:iCs/>
         </w:rPr>
-        <w:t xml:space="preserve">BMJ Evidence-Based Medicine</w:t>
+        <w:t xml:space="preserve">BMJ Evid-Based Med</w:t>
       </w:r>
       <w:r>
         <w:t xml:space="preserve"> </w:t>
@@ -11153,7 +11174,7 @@
           <w:i/>
           <w:iCs/>
         </w:rPr>
-        <w:t xml:space="preserve">Sleep Medicine Reviews</w:t>
+        <w:t xml:space="preserve">Sleep Med Rev</w:t>
       </w:r>
       <w:r>
         <w:t xml:space="preserve"> </w:t>
@@ -11191,7 +11212,7 @@
         <w:t xml:space="preserve">	</w:t>
       </w:r>
       <w:r>
-        <w:t xml:space="preserve">Huang WY, Ho RS, Tremblay MS, Wong SH.</w:t>
+        <w:t xml:space="preserve">Huang WY, Ho RS-T, Tremblay MS, Wong SH-S.</w:t>
       </w:r>
       <w:r>
         <w:t xml:space="preserve"> </w:t>
@@ -11239,7 +11260,7 @@
           <w:i/>
           <w:iCs/>
         </w:rPr>
-        <w:t xml:space="preserve">Journal of Sleep Research</w:t>
+        <w:t xml:space="preserve">J Sleep Res</w:t>
       </w:r>
       <w:r>
         <w:t xml:space="preserve"> </w:t>
@@ -11311,7 +11332,7 @@
           <w:i/>
           <w:iCs/>
         </w:rPr>
-        <w:t xml:space="preserve">Communications Medicine</w:t>
+        <w:t xml:space="preserve">Commun Med</w:t>
       </w:r>
       <w:r>
         <w:t xml:space="preserve"> </w:t>
@@ -11407,7 +11428,7 @@
           <w:i/>
           <w:iCs/>
         </w:rPr>
-        <w:t xml:space="preserve">Proceedings of the National Academy of Sciences</w:t>
+        <w:t xml:space="preserve">Proc Natl Acad Sci</w:t>
       </w:r>
       <w:r>
         <w:t xml:space="preserve"> </w:t>
@@ -11469,7 +11490,7 @@
           <w:i/>
           <w:iCs/>
         </w:rPr>
-        <w:t xml:space="preserve">npj Biological Timing and Sleep</w:t>
+        <w:t xml:space="preserve">Npj Biol Timing Sleep</w:t>
       </w:r>
       <w:r>
         <w:t xml:space="preserve"> </w:t>
@@ -11531,7 +11552,7 @@
           <w:i/>
           <w:iCs/>
         </w:rPr>
-        <w:t xml:space="preserve">Applied Physiology, Nutrition, and Metabolism</w:t>
+        <w:t xml:space="preserve">Appl Physiol Nutr Metab</w:t>
       </w:r>
       <w:r>
         <w:t xml:space="preserve"> </w:t>
@@ -11593,7 +11614,7 @@
           <w:i/>
           <w:iCs/>
         </w:rPr>
-        <w:t xml:space="preserve">British Journal of Sports Medicine</w:t>
+        <w:t xml:space="preserve">Br J Sports Med</w:t>
       </w:r>
       <w:r>
         <w:t xml:space="preserve"> </w:t>
@@ -11873,7 +11894,7 @@
           <w:i/>
           <w:iCs/>
         </w:rPr>
-        <w:t xml:space="preserve">Journal for the Measurement of Physical Behaviour</w:t>
+        <w:t xml:space="preserve">J Meas Phys Behav</w:t>
       </w:r>
       <w:r>
         <w:t xml:space="preserve"> </w:t>
@@ -11934,7 +11955,7 @@
           <w:i/>
           <w:iCs/>
         </w:rPr>
-        <w:t xml:space="preserve">Scientific Reports</w:t>
+        <w:t xml:space="preserve">Sci Rep</w:t>
       </w:r>
       <w:r>
         <w:t xml:space="preserve"> </w:t>
@@ -12077,7 +12098,7 @@
           <w:i/>
           <w:iCs/>
         </w:rPr>
-        <w:t xml:space="preserve">Journal for the Measurement of Physical Behaviour</w:t>
+        <w:t xml:space="preserve">J Meas Phys Behav</w:t>
       </w:r>
       <w:r>
         <w:t xml:space="preserve"> </w:t>
@@ -12287,7 +12308,7 @@
           <w:i/>
           <w:iCs/>
         </w:rPr>
-        <w:t xml:space="preserve">SLEEP</w:t>
+        <w:t xml:space="preserve">Sleep</w:t>
       </w:r>
       <w:r>
         <w:t xml:space="preserve"> </w:t>
@@ -12643,7 +12664,7 @@
           <w:i/>
           <w:iCs/>
         </w:rPr>
-        <w:t xml:space="preserve">Pediatric Exercise Science</w:t>
+        <w:t xml:space="preserve">Pediatr Exerc Sci</w:t>
       </w:r>
       <w:r>
         <w:t xml:space="preserve"> </w:t>
@@ -12704,7 +12725,7 @@
           <w:i/>
           <w:iCs/>
         </w:rPr>
-        <w:t xml:space="preserve">Sports Medicine - Open</w:t>
+        <w:t xml:space="preserve">Sports Med - Open</w:t>
       </w:r>
       <w:r>
         <w:t xml:space="preserve"> </w:t>
@@ -12787,7 +12808,7 @@
           <w:i/>
           <w:iCs/>
         </w:rPr>
-        <w:t xml:space="preserve">Journal of Science and Medicine in Sport</w:t>
+        <w:t xml:space="preserve">J Sci Med Sport</w:t>
       </w:r>
       <w:r>
         <w:t xml:space="preserve"> </w:t>
@@ -12933,7 +12954,7 @@
           <w:i/>
           <w:iCs/>
         </w:rPr>
-        <w:t xml:space="preserve">Advances in Methods and Practices in Psychological Science</w:t>
+        <w:t xml:space="preserve">Adv Methods Pract Psychol Sci</w:t>
       </w:r>
       <w:r>
         <w:t xml:space="preserve"> </w:t>
@@ -13120,7 +13141,7 @@
           <w:i/>
           <w:iCs/>
         </w:rPr>
-        <w:t xml:space="preserve">Journal of Statistical Software</w:t>
+        <w:t xml:space="preserve">J Stat Softw</w:t>
       </w:r>
       <w:r>
         <w:t xml:space="preserve"> </w:t>
@@ -13214,7 +13235,7 @@
           <w:i/>
           <w:iCs/>
         </w:rPr>
-        <w:t xml:space="preserve">Psychological Methods</w:t>
+        <w:t xml:space="preserve">Psychol Methods</w:t>
       </w:r>
       <w:r>
         <w:t xml:space="preserve"> </w:t>
@@ -13286,7 +13307,7 @@
           <w:i/>
           <w:iCs/>
         </w:rPr>
-        <w:t xml:space="preserve">Nature Communications</w:t>
+        <w:t xml:space="preserve">Nat Commun</w:t>
       </w:r>
       <w:r>
         <w:t xml:space="preserve"> </w:t>
@@ -13358,7 +13379,7 @@
           <w:i/>
           <w:iCs/>
         </w:rPr>
-        <w:t xml:space="preserve">Sleep Medicine Reviews</w:t>
+        <w:t xml:space="preserve">Sleep Med Rev</w:t>
       </w:r>
       <w:r>
         <w:t xml:space="preserve"> </w:t>
@@ -13672,7 +13693,7 @@
           <w:i/>
           <w:iCs/>
         </w:rPr>
-        <w:t xml:space="preserve">Journal of Epidemiology and Community Health</w:t>
+        <w:t xml:space="preserve">J Epidemiol Community Health</w:t>
       </w:r>
       <w:r>
         <w:t xml:space="preserve"> </w:t>
@@ -13744,7 +13765,7 @@
           <w:i/>
           <w:iCs/>
         </w:rPr>
-        <w:t xml:space="preserve">Psychological Medicine</w:t>
+        <w:t xml:space="preserve">Psychol Med</w:t>
       </w:r>
       <w:r>
         <w:t xml:space="preserve"> </w:t>
@@ -13805,7 +13826,7 @@
           <w:i/>
           <w:iCs/>
         </w:rPr>
-        <w:t xml:space="preserve">International Journal of Behavioral Nutrition and Physical Activity</w:t>
+        <w:t xml:space="preserve">Int J Behav Nutr Phys Act</w:t>
       </w:r>
       <w:r>
         <w:t xml:space="preserve"> </w:t>
@@ -13883,7 +13904,7 @@
           <w:i/>
           <w:iCs/>
         </w:rPr>
-        <w:t xml:space="preserve">Journal of Sleep Research</w:t>
+        <w:t xml:space="preserve">J Sleep Res</w:t>
       </w:r>
       <w:r>
         <w:t xml:space="preserve"> </w:t>

</xml_diff>

<commit_message>
Address some minor changes
</commit_message>
<xml_diff>
--- a/doc/manuscript.docx
+++ b/doc/manuscript.docx
@@ -87,7 +87,7 @@
         <w:t xml:space="preserve">8</w:t>
       </w:r>
       <w:r>
-        <w:t xml:space="preserve">, Shona Halson PhD</w:t>
+        <w:t xml:space="preserve">, Shona L. Halson PhD</w:t>
       </w:r>
       <w:r>
         <w:rPr>
@@ -149,7 +149,7 @@
         <w:t xml:space="preserve">2</w:t>
       </w:r>
       <w:r>
-        <w:t xml:space="preserve">School of Behavioural and Health Science, Australian Catholic University, North Sydney, Australia</w:t>
+        <w:t xml:space="preserve">School of Behavioural and Health Science, Australian Catholic University, Strathfield, Australia</w:t>
       </w:r>
       <w:r>
         <w:br/>
@@ -197,7 +197,7 @@
         <w:t xml:space="preserve">6</w:t>
       </w:r>
       <w:r>
-        <w:t xml:space="preserve">School of Psychology, University of Queensland, Brisbane, Australia</w:t>
+        <w:t xml:space="preserve">School of Psychology, The University of Queensland, Brisbane, Australia</w:t>
       </w:r>
       <w:r>
         <w:br/>
@@ -267,7 +267,7 @@
         <w:pStyle w:val="BodyText"/>
       </w:pPr>
       <w:r>
-        <w:t xml:space="preserve">Main text: 3317 words</w:t>
+        <w:t xml:space="preserve">Main text: 3359 words</w:t>
       </w:r>
     </w:p>
     <w:p>
@@ -359,13 +359,7 @@
         <w:t xml:space="preserve"> </w:t>
       </w:r>
       <w:r>
-        <w:t xml:space="preserve">We included 27,236 participants aged 2 to 94 years from 20 studies.</w:t>
-      </w:r>
-      <w:r>
-        <w:t xml:space="preserve"> </w:t>
-      </w:r>
-      <w:r>
-        <w:t xml:space="preserve">Higher physical activity volume was associated with longer, more efficient, earlier, and more regular sleep.</w:t>
+        <w:t xml:space="preserve">In 27,236 participants aged 2 to 94 years from 20 studies, higher physical activity volume was associated with longer, more efficient, earlier, and more regular sleep.</w:t>
       </w:r>
       <w:r>
         <w:t xml:space="preserve"> </w:t>
@@ -401,7 +395,7 @@
         <w:t xml:space="preserve"> </w:t>
       </w:r>
       <w:r>
-        <w:t xml:space="preserve">Public health messages could promote physical activity for regular sleep, rather than as a universal sleep remedy.</w:t>
+        <w:t xml:space="preserve">Because irregular sleep predicts poor health independently of sleep duration, public health messages could promote physical activity for regular sleep, rather than as a universal sleep remedy.</w:t>
       </w:r>
     </w:p>
     <w:p>
@@ -419,7 +413,7 @@
         <w:t xml:space="preserve"> </w:t>
       </w:r>
       <w:r>
-        <w:t xml:space="preserve">This research was unfunded. Refer to the included studies for their funding sources.</w:t>
+        <w:t xml:space="preserve">This research was unfunded.</w:t>
       </w:r>
     </w:p>
     <w:bookmarkEnd w:id="9"/>
@@ -487,7 +481,7 @@
         <w:t xml:space="preserve"> </w:t>
       </w:r>
       <w:r>
-        <w:t xml:space="preserve">These have been synthesised separately in adults, where a meta-analysis of 33 studies did not support a bidirectional daily association, and in children and youth.</w:t>
+        <w:t xml:space="preserve">These have been synthesised separately in adults, where a meta-analysis of 33 studies did not support a bidirectional daily association, and in children and youth, where a meta-analysis of 11 studies found weak and inconsistent associations.</w:t>
       </w:r>
       <w:r>
         <w:t xml:space="preserve"> </w:t>
@@ -571,13 +565,13 @@
         <w:t xml:space="preserve"> </w:t>
       </w:r>
       <w:r>
-        <w:t xml:space="preserve">Public health messages should present physical activity as a way to support consistent sleep schedules, as Australia’s 24-hour movement guidelines do, rather than as a universal remedy for poor sleep.</w:t>
-      </w:r>
-      <w:r>
-        <w:t xml:space="preserve"> </w:t>
-      </w:r>
-      <w:r>
-        <w:t xml:space="preserve">That our strongest association varied little with age suggests that the weaker evidence in children and adolescents may reflect study design or measurement rather than age.</w:t>
+        <w:t xml:space="preserve">Public health messages should present physical activity as a way to support consistent sleep schedules, as Canada’s andAustralia’s 24-hour movement guidelines do, rather than as a universal remedy for poor sleep.</w:t>
+      </w:r>
+      <w:r>
+        <w:t xml:space="preserve"> </w:t>
+      </w:r>
+      <w:r>
+        <w:t xml:space="preserve">That our strongest association varied little with age suggests that the existing weaker evidence in children and adolescents may reflect study design or measurement rather than age.</w:t>
       </w:r>
       <w:r>
         <w:t xml:space="preserve"> </w:t>
@@ -807,7 +801,7 @@
         <w:t xml:space="preserve">14</w:t>
       </w:r>
       <w:r>
-        <w:t xml:space="preserve"> Weekly averages may mask these patterns, and pooling device-measured individual participant data can overcome these limitations.</w:t>
+        <w:t xml:space="preserve"> Weekly averages likely mask these patterns, and pooling device-measured individual participant data can overcome these limitations.</w:t>
       </w:r>
       <w:r>
         <w:rPr>
@@ -948,7 +942,7 @@
         <w:t xml:space="preserve"> </w:t>
       </w:r>
       <w:r>
-        <w:t xml:space="preserve">The Australian Catholic University’s Research Ethics Committee granted permission for each study’s data to be obtained (approval: 2020-143N), and investigators transferred their deidentified data via a secure file-sharing system.</w:t>
+        <w:t xml:space="preserve">The Australian Catholic University’s Research Ethics Committee granted permission for each study’s data to be obtained (approval: 2020-143N), and investigators transferred their deidentified data via a secure file-sharing system subject to original institutional ethics approvals or new data transfer agreements.</w:t>
       </w:r>
     </w:p>
     <w:bookmarkEnd w:id="15"/>
@@ -966,7 +960,7 @@
         <w:pStyle w:val="FirstParagraph"/>
       </w:pPr>
       <w:r>
-        <w:t xml:space="preserve">We harmonised all accelerometer data by reprocessing the raw files with the open-source</w:t>
+        <w:t xml:space="preserve">We harmonised all accelerometer data by reprocessing raw files with the open-source</w:t>
       </w:r>
       <w:r>
         <w:t xml:space="preserve"> </w:t>
@@ -991,7 +985,7 @@
         <w:t xml:space="preserve">19,20</w:t>
       </w:r>
       <w:r>
-        <w:t xml:space="preserve"> to produce outcomes as comparable as possible across studies, device wear locations, and populations.</w:t>
+        <w:t xml:space="preserve"> to produce comparable outcomes across studies, device wear locations, and populations.</w:t>
       </w:r>
       <w:r>
         <w:t xml:space="preserve"> </w:t>
@@ -1013,7 +1007,7 @@
         <w:t xml:space="preserve"> </w:t>
       </w:r>
       <w:r>
-        <w:t xml:space="preserve">R package, which fixed all settings across studies and documents the decisions made for specific devices.</w:t>
+        <w:t xml:space="preserve">R package, which fixed settings across studies and documented the decisions made for specific devices.</w:t>
       </w:r>
       <w:r>
         <w:rPr>
@@ -1072,7 +1066,7 @@
         <w:t xml:space="preserve">22</w:t>
       </w:r>
       <w:r>
-        <w:t xml:space="preserve"> Non-wear time and abnormally high accelerations were detected with the default settings, classified as missing, and imputed from the same time interval on the remaining days of the week.</w:t>
+        <w:t xml:space="preserve"> Non-wear time and abnormally high accelerations were detected by default settings, classified as missing, and imputed from the same time interval on the remaining days of the week.</w:t>
       </w:r>
       <w:r>
         <w:rPr>
@@ -1163,7 +1157,7 @@
         <w:t xml:space="preserve"> </w:t>
       </w:r>
       <w:r>
-        <w:t xml:space="preserve">These metrics capture the whole intensity continuum without the population-specific cut-points that collapse it into categories.</w:t>
+        <w:t xml:space="preserve">These metrics capture the whole intensity continuum without the population-specific absolute intensity cut-points that collapse it into categories.</w:t>
       </w:r>
     </w:p>
     <w:bookmarkEnd w:id="16"/>
@@ -1193,13 +1187,13 @@
         <w:t xml:space="preserve"> </w:t>
       </w:r>
       <w:r>
-        <w:t xml:space="preserve">The country, city, time zone, daylight length, and season in which data were collected were also obtained.</w:t>
-      </w:r>
-      <w:r>
-        <w:t xml:space="preserve"> </w:t>
-      </w:r>
-      <w:r>
-        <w:t xml:space="preserve">Because studies measured socioeconomic status differently (e.g., education or income), we harmonised each study’s measure into low, medium, and high categories (appendix).</w:t>
+        <w:t xml:space="preserve">The country, city, time zone, daylight length, and season in which data were collected were also obtained from the original studies.</w:t>
+      </w:r>
+      <w:r>
+        <w:t xml:space="preserve"> </w:t>
+      </w:r>
+      <w:r>
+        <w:t xml:space="preserve">Because studies measured socioeconomic status differently (e.g., education or income), we harmonised each study’s measure into low, medium, and high categories (see appendix).</w:t>
       </w:r>
     </w:p>
     <w:p>
@@ -1253,7 +1247,7 @@
         <w:pStyle w:val="FirstParagraph"/>
       </w:pPr>
       <w:r>
-        <w:t xml:space="preserve">To reduce the risk of bias, we used a blind analysis approach: we developed and tested models on a 10% holdout subsample of the dataset and conducted the final analysis once we believed the code was ready.</w:t>
+        <w:t xml:space="preserve">To reduce the risk of bias, we used a blind analysis approach: we developed and tested models on a 10% holdout subsample of the dataset and conducted the final analysis once we determined the code was ready.</w:t>
       </w:r>
       <w:r>
         <w:t xml:space="preserve"> </w:t>
@@ -1401,7 +1395,7 @@
         <w:t xml:space="preserve"> </w:t>
       </w:r>
       <w:r>
-        <w:t xml:space="preserve">While working with the holdout data we made three changes to the protocol.</w:t>
+        <w:t xml:space="preserve">While testing with the holdout data we made three changes to the protocol.</w:t>
       </w:r>
       <w:r>
         <w:t xml:space="preserve"> </w:t>
@@ -1455,7 +1449,7 @@
         <w:pStyle w:val="FirstParagraph"/>
       </w:pPr>
       <w:r>
-        <w:t xml:space="preserve">There was no funding source for this study.</w:t>
+        <w:t xml:space="preserve">None.</w:t>
       </w:r>
     </w:p>
     <w:bookmarkEnd w:id="20"/>
@@ -8915,7 +8909,7 @@
         <w:t xml:space="preserve"> </w:t>
       </w:r>
       <w:r>
-        <w:t xml:space="preserve">These relationships were the strongest for sleep regularity, although the relationship with physical activity intensity weakened with age.</w:t>
+        <w:t xml:space="preserve">These relationships were strongest for sleep regularity, although the relationship with physical activity intensity weakened with age.</w:t>
       </w:r>
       <w:r>
         <w:t xml:space="preserve"> </w:t>
@@ -9040,10 +9034,7 @@
         <w:pStyle w:val="BodyText"/>
       </w:pPr>
       <w:r>
-        <w:t xml:space="preserve">Among observational studies of day-to-day sleep and physical activity, a meta-analysis of 33 studies in adults did not support a bidirectional daily association</w:t>
-      </w:r>
-      <w:r>
-        <w:t xml:space="preserve">.</w:t>
+        <w:t xml:space="preserve">Among observational studies of day-to-day sleep and physical activity, a meta-analysis of 33 studies in adults did not support a bidirectional daily association.</w:t>
       </w:r>
       <w:r>
         <w:rPr>
@@ -9058,7 +9049,16 @@
         <w:t xml:space="preserve"> </w:t>
       </w:r>
       <w:r>
-        <w:t xml:space="preserve">Two recent studies of consumer wearables found that previous-day activity had little association with sleep,</w:t>
+        <w:t xml:space="preserve">In children and youth aged 5–15 years, a meta-analysis of 11 studies found that more sedentary time was followed by slightly shorter sleep, while associations of physical activity with sleep were weak and inconsistent.</w:t>
+      </w:r>
+      <w:r>
+        <w:rPr>
+          <w:vertAlign w:val="superscript"/>
+        </w:rPr>
+        <w:t xml:space="preserve">15</w:t>
+      </w:r>
+      <w:r>
+        <w:t xml:space="preserve"> Two recent studies of consumer wearables found that previous-day activity had little association with sleep,</w:t>
       </w:r>
       <w:r>
         <w:rPr>
@@ -9299,31 +9299,28 @@
         <w:t xml:space="preserve"> </w:t>
       </w:r>
       <w:r>
-        <w:t xml:space="preserve">This message fits with Australia’s recent 24-hour movement guidelines for adults, which pair physical activity recommendations with consistent bed and wake times.</w:t>
+        <w:t xml:space="preserve">This message fits with 24-hour movement guidelines in Canada and Australia, which pair physical activity recommendations with consistent bed and wake times.</w:t>
+      </w:r>
+      <w:r>
+        <w:t xml:space="preserve"> </w:t>
+      </w:r>
+      <w:r>
+        <w:t xml:space="preserve">There are well established links between sleep and overall health,</w:t>
       </w:r>
       <w:r>
         <w:rPr>
           <w:vertAlign w:val="superscript"/>
         </w:rPr>
-        <w:t xml:space="preserve">30</w:t>
-      </w:r>
-      <w:r>
-        <w:t xml:space="preserve"> Given the well-established links between sleep and overall health,</w:t>
-      </w:r>
-      <w:r>
-        <w:rPr>
-          <w:vertAlign w:val="superscript"/>
-        </w:rPr>
         <w:t xml:space="preserve">1</w:t>
       </w:r>
       <w:r>
-        <w:t xml:space="preserve"> incorporating physical activity into public health messaging may have downstream benefits for population health.</w:t>
-      </w:r>
-      <w:r>
-        <w:t xml:space="preserve"> </w:t>
-      </w:r>
-      <w:r>
-        <w:t xml:space="preserve">However, physical activity was more weakly and less consistently associated with sleep duration, efficiency, and onset, so public health messages should emphasise its role in promoting consistent sleep schedules rather than framing it as a universal solution for improving sleep.</w:t>
+        <w:t xml:space="preserve"> and physical activity is already central to public health messaging.</w:t>
+      </w:r>
+      <w:r>
+        <w:t xml:space="preserve"> </w:t>
+      </w:r>
+      <w:r>
+        <w:t xml:space="preserve">Our findings support an under-recognised pathway for benefits; physical activity was more weakly and less consistently associated with sleep duration, efficiency, and onset, so public health messages should emphasise its role in promoting consistent sleep schedules rather than framing it as a universal solution for improving sleep.</w:t>
       </w:r>
       <w:r>
         <w:t xml:space="preserve"> </w:t>
@@ -9371,7 +9368,7 @@
         <w:pStyle w:val="FirstParagraph"/>
       </w:pPr>
       <w:r>
-        <w:t xml:space="preserve">We declare no competing interests</w:t>
+        <w:t xml:space="preserve">We declare no competing interests.</w:t>
       </w:r>
     </w:p>
     <w:bookmarkEnd w:id="52"/>
@@ -9452,7 +9449,7 @@
         <w:br w:type="page"/>
       </w:r>
     </w:p>
-    <w:bookmarkStart w:id="117" w:name="references"/>
+    <w:bookmarkStart w:id="115" w:name="references"/>
     <w:p>
       <w:pPr>
         <w:pStyle w:val="Heading1"/>
@@ -9461,7 +9458,7 @@
         <w:t xml:space="preserve">References</w:t>
       </w:r>
     </w:p>
-    <w:bookmarkStart w:id="116" w:name="refs"/>
+    <w:bookmarkStart w:id="114" w:name="refs"/>
     <w:bookmarkStart w:id="57" w:name="ref-huangSleepPhysicalActivity2022"/>
     <w:p>
       <w:pPr>
@@ -12018,53 +12015,8 @@
       </w:r>
     </w:p>
     <w:bookmarkEnd w:id="113"/>
-    <w:bookmarkStart w:id="115" w:name="X639320ef06b9a00f96c25d59c61d1cecd19efb7"/>
-    <w:p>
-      <w:pPr>
-        <w:pStyle w:val="Bibliography"/>
-      </w:pPr>
-      <w:r>
-        <w:t xml:space="preserve">30</w:t>
-      </w:r>
-      <w:r>
-        <w:t xml:space="preserve"> </w:t>
-      </w:r>
-      <w:r>
-        <w:t xml:space="preserve">	</w:t>
-      </w:r>
-      <w:r>
-        <w:t xml:space="preserve">Australian Government Department of Health, Disability and Ageing. 24-hour movement guidelines for all</w:t>
-      </w:r>
-      <w:r>
-        <w:t xml:space="preserve"> </w:t>
-      </w:r>
-      <w:r>
-        <w:t xml:space="preserve">Australians</w:t>
-      </w:r>
-      <w:r>
-        <w:t xml:space="preserve">. 2026; published online April.</w:t>
-      </w:r>
-      <w:r>
-        <w:t xml:space="preserve"> </w:t>
-      </w:r>
-      <w:hyperlink r:id="rId114">
-        <w:r>
-          <w:rPr>
-            <w:rStyle w:val="Hyperlink"/>
-          </w:rPr>
-          <w:t xml:space="preserve">https://www.health.gov.au/topics/physical-activity/24-hour-movement-guidelines-for-all-australians</w:t>
-        </w:r>
-      </w:hyperlink>
-      <w:r>
-        <w:t xml:space="preserve"> </w:t>
-      </w:r>
-      <w:r>
-        <w:t xml:space="preserve">(accessed Oct 10, 2026).</w:t>
-      </w:r>
-    </w:p>
+    <w:bookmarkEnd w:id="114"/>
     <w:bookmarkEnd w:id="115"/>
-    <w:bookmarkEnd w:id="116"/>
-    <w:bookmarkEnd w:id="117"/>
     <w:sectPr>
       <w:footerReference r:id="rIdFtr1" w:type="default"/>
       <w:footnotePr>

</xml_diff>